<commit_message>
chore: 작업 자동 저장 (2026-08-19 18:55)
</commit_message>
<xml_diff>
--- a/docs/government-project/01-1_화면설계서.docx
+++ b/docs/government-project/01-1_화면설계서.docx
@@ -729,7 +729,7 @@
                 <w:sz w:val="18"/>
                 <w:rFonts w:eastAsia="맑은 고딕"/>
               </w:rPr>
-              <w:t>통합 문의 접수 (2단계)</w:t>
+              <w:t>문의 — 연락 방법 고르기 → 신청서</w:t>
             </w:r>
           </w:p>
         </w:tc>
@@ -746,7 +746,7 @@
                 <w:sz w:val="18"/>
                 <w:rFonts w:eastAsia="맑은 고딕"/>
               </w:rPr>
-              <w:t>/inquiry</w:t>
+              <w:t>/inquiry  (한 화면에서 단계 전환)</w:t>
             </w:r>
           </w:p>
         </w:tc>
@@ -1251,7 +1251,7 @@
                 <w:sz w:val="18"/>
                 <w:rFonts w:eastAsia="맑은 고딕"/>
               </w:rPr>
-              <w:t>사후관리 — 환자 포털</w:t>
+              <w:t>사후관리 — 환자 화면</w:t>
             </w:r>
           </w:p>
         </w:tc>
@@ -1268,7 +1268,7 @@
                 <w:sz w:val="18"/>
                 <w:rFonts w:eastAsia="맑은 고딕"/>
               </w:rPr>
-              <w:t>/portal</w:t>
+              <w:t>/patient  (로그인)</w:t>
             </w:r>
           </w:p>
         </w:tc>
@@ -1302,7 +1302,7 @@
                 <w:sz w:val="18"/>
                 <w:rFonts w:eastAsia="맑은 고딕"/>
               </w:rPr>
-              <w:t>환자(로그인)</w:t>
+              <w:t>환자</w:t>
             </w:r>
           </w:p>
         </w:tc>
@@ -1712,7 +1712,7 @@
       <w:r>
         <w:drawing>
           <wp:inline xmlns:a="http://schemas.openxmlformats.org/drawingml/2006/main" xmlns:pic="http://schemas.openxmlformats.org/drawingml/2006/picture">
-            <wp:extent cx="5760720" cy="4147718"/>
+            <wp:extent cx="5760720" cy="4378147"/>
             <wp:docPr id="1" name="Picture 1"/>
             <wp:cNvGraphicFramePr>
               <a:graphicFrameLocks noChangeAspect="1"/>
@@ -1733,7 +1733,7 @@
                   <pic:spPr>
                     <a:xfrm>
                       <a:off x="0" y="0"/>
-                      <a:ext cx="5760720" cy="4147718"/>
+                      <a:ext cx="5760720" cy="4378147"/>
                     </a:xfrm>
                     <a:prstGeom prst="rect"/>
                   </pic:spPr>
@@ -1766,7 +1766,7 @@
           <w:sz w:val="18"/>
           <w:rFonts w:eastAsia="맑은 고딕"/>
         </w:rPr>
-        <w:t>· 상단 바 — 로고·메뉴·언어 전환(6개 언어)·로그인</w:t>
+        <w:t>· 상단 바 — 로고 + [≡] 메뉴 (언어 전환·로그인은 메뉴 안에 있다)</w:t>
       </w:r>
     </w:p>
     <w:p>
@@ -1780,7 +1780,7 @@
           <w:sz w:val="18"/>
           <w:rFonts w:eastAsia="맑은 고딕"/>
         </w:rPr>
-        <w:t>· 히어로 — 한 줄 가치 제안 + [상담 시작] [문의 남기기]</w:t>
+        <w:t>· 히어로 — 큰 제목 「한국 최고 종양 전문의의 제2의견」 + 부제 3줄 + 단추 [무료 상담] 하나</w:t>
       </w:r>
     </w:p>
     <w:p>
@@ -1794,7 +1794,7 @@
           <w:sz w:val="18"/>
           <w:rFonts w:eastAsia="맑은 고딕"/>
         </w:rPr>
-        <w:t>· AI 사전상담 진입 카드 — 24시간 응대</w:t>
+        <w:t>· 본문 큰 덩어리 10개 — 왜 한국인가 / 우리 의료팀 / healwith 가 하는 일 / 어떻게 진행되나 / 주요 암종 / 파트너 병원 / 진단부터 회복까지 동행 / 자주 묻는 질문 / 긴급 도움 / 오늘 시작하기</w:t>
       </w:r>
     </w:p>
     <w:p>
@@ -1808,7 +1808,7 @@
           <w:sz w:val="18"/>
           <w:rFonts w:eastAsia="맑은 고딕"/>
         </w:rPr>
-        <w:t>· 안내 카드 4종 — 암종별 안내 · 협진 병원 · 치료 절차 · 비용 안내</w:t>
+        <w:t>· 우하단 — 떠 있는 대화 단추(「도움말」 말풍선) = AI 상담 진입점</w:t>
       </w:r>
     </w:p>
     <w:p>
@@ -1822,7 +1822,7 @@
           <w:sz w:val="18"/>
           <w:rFonts w:eastAsia="맑은 고딕"/>
         </w:rPr>
-        <w:t>· 환자 여정 7단계 도식</w:t>
+        <w:t>· 맨아래 — 유치업 등록번호 · 보증보험 · 법정 고지 · 개인정보 처리방침</w:t>
       </w:r>
     </w:p>
     <w:p>
@@ -1836,7 +1836,7 @@
           <w:sz w:val="18"/>
           <w:rFonts w:eastAsia="맑은 고딕"/>
         </w:rPr>
-        <w:t>· 하단 — 유치업 등록번호 · 보증보험 · 법정 고지 · 개인정보 처리방침</w:t>
+        <w:t>· 첫 방문 시 화면 아래 쿠키 설정 띠</w:t>
       </w:r>
     </w:p>
     <w:p>
@@ -1914,7 +1914,7 @@
           <w:sz w:val="18"/>
           <w:rFonts w:eastAsia="맑은 고딕"/>
         </w:rPr>
-        <w:t>→ P-02 문의 접수 · P-03 AI 사전상담</w:t>
+        <w:t>→ P-02 문의 갈림길 · P-03 AI 사전상담(우하단 대화 단추)</w:t>
       </w:r>
     </w:p>
     <w:p>
@@ -1972,7 +1972,7 @@
           <w:sz w:val="24"/>
           <w:rFonts w:eastAsia="맑은 고딕"/>
         </w:rPr>
-        <w:t>P-02. 통합 문의 접수 (2단계)</w:t>
+        <w:t>P-02. 문의 — 연락 방법 고르기 → 신청서</w:t>
       </w:r>
     </w:p>
     <w:tbl>
@@ -2090,7 +2090,7 @@
                 <w:sz w:val="18"/>
                 <w:rFonts w:eastAsia="맑은 고딕"/>
               </w:rPr>
-              <w:t>/inquiry</w:t>
+              <w:t>/inquiry  (한 화면에서 단계 전환)</w:t>
             </w:r>
           </w:p>
         </w:tc>
@@ -2162,7 +2162,7 @@
                 <w:sz w:val="18"/>
                 <w:rFonts w:eastAsia="맑은 고딕"/>
               </w:rPr>
-              <w:t>자료가 아직 없어도 접수되게 문턱을 낮추고, 대학병원 의뢰에 필요한 자료는 2단계에서 받는다.</w:t>
+              <w:t>먼저 «연락하기 편한 방법»을 고르게 해 문턱을 낮추고, 신청서를 고른 사람만 폼으로 보낸다. 대학병원 의뢰에 필요한 자료는 접수 뒤 2단계에서 받는다.</w:t>
             </w:r>
           </w:p>
         </w:tc>
@@ -2176,7 +2176,7 @@
       <w:r>
         <w:drawing>
           <wp:inline xmlns:a="http://schemas.openxmlformats.org/drawingml/2006/main" xmlns:pic="http://schemas.openxmlformats.org/drawingml/2006/picture">
-            <wp:extent cx="5760720" cy="4147718"/>
+            <wp:extent cx="5760720" cy="4378147"/>
             <wp:docPr id="2" name="Picture 2"/>
             <wp:cNvGraphicFramePr>
               <a:graphicFrameLocks noChangeAspect="1"/>
@@ -2197,7 +2197,7 @@
                   <pic:spPr>
                     <a:xfrm>
                       <a:off x="0" y="0"/>
-                      <a:ext cx="5760720" cy="4147718"/>
+                      <a:ext cx="5760720" cy="4378147"/>
                     </a:xfrm>
                     <a:prstGeom prst="rect"/>
                   </pic:spPr>
@@ -2230,7 +2230,7 @@
           <w:sz w:val="18"/>
           <w:rFonts w:eastAsia="맑은 고딕"/>
         </w:rPr>
-        <w:t>· 진행 표시 — 1단계 접수 / 2단계 대학병원 의뢰 준비</w:t>
+        <w:t>· 갈림길 — ① AI 상담원(러시아어 24시간) / ② 실시간 상담원(메신저) / ③ 신청서 작성</w:t>
       </w:r>
     </w:p>
     <w:p>
@@ -2244,7 +2244,7 @@
           <w:sz w:val="18"/>
           <w:rFonts w:eastAsia="맑은 고딕"/>
         </w:rPr>
-        <w:t>· 1단계 — 이름·연락 수단·국적·언어 / 암종·병기 / 하고 싶은 말</w:t>
+        <w:t>· 신뢰 표시 — 무료 상담 · 병원에 직접 결제(수수료 없음) · AES-256 암호화 · 1영업일 내 회신 · KHIDI 지원사업 · 등록 유치업자</w:t>
       </w:r>
     </w:p>
     <w:p>
@@ -2258,7 +2258,7 @@
           <w:sz w:val="18"/>
           <w:rFonts w:eastAsia="맑은 고딕"/>
         </w:rPr>
-        <w:t>· 2단계 — 진단서·검사지·영상(CD 폴더째) / 여권 라틴 표기 / 보험</w:t>
+        <w:t>· ③을 고르면 1단계 접수 — 이름 · 연락 수단 · 국적 · 선호 언어 / 암종 · 병기 / 하고 싶은 말</w:t>
       </w:r>
     </w:p>
     <w:p>
@@ -2272,7 +2272,7 @@
           <w:sz w:val="18"/>
           <w:rFonts w:eastAsia="맑은 고딕"/>
         </w:rPr>
-        <w:t>· 자료 묶음 끌어다 놓기 — 올리는 즉시 무엇인지 자동 판독, 빠진 서류만 알려줌</w:t>
+        <w:t>· 동의 4종(필수) — 개인정보 수집 · 민감정보(건강) · 제3자 제공(병원) · 국외이전</w:t>
       </w:r>
     </w:p>
     <w:p>
@@ -2286,7 +2286,7 @@
           <w:sz w:val="18"/>
           <w:rFonts w:eastAsia="맑은 고딕"/>
         </w:rPr>
-        <w:t>· 아래 고정 막대 — 남은 항목 · [보내기]</w:t>
+        <w:t>· 접수 뒤 2단계 — 별도 주소 /inquiry/intake (문의번호·열쇠 필요). 첨부 최대 10개, 건당 200MB</w:t>
       </w:r>
     </w:p>
     <w:p>
@@ -2376,6 +2376,36 @@
           <w:rFonts w:eastAsia="맑은 고딕"/>
         </w:rPr>
         <w:t>설계 메모</w:t>
+      </w:r>
+    </w:p>
+    <w:p>
+      <w:pPr>
+        <w:ind w:left="283"/>
+      </w:pPr>
+      <w:r>
+        <w:rPr>
+          <w:rFonts w:ascii="맑은 고딕" w:hAnsi="맑은 고딕"/>
+          <w:b w:val="0"/>
+          <w:color w:val="6E6E6E"/>
+          <w:sz w:val="18"/>
+          <w:rFonts w:eastAsia="맑은 고딕"/>
+        </w:rPr>
+        <w:t>※ /inquiry 는 폼이 아니라 «갈림길»이 먼저 나온다(2026-08-19 실서비스 확인).</w:t>
+      </w:r>
+    </w:p>
+    <w:p>
+      <w:pPr>
+        <w:ind w:left="283"/>
+      </w:pPr>
+      <w:r>
+        <w:rPr>
+          <w:rFonts w:ascii="맑은 고딕" w:hAnsi="맑은 고딕"/>
+          <w:b w:val="0"/>
+          <w:color w:val="6E6E6E"/>
+          <w:sz w:val="18"/>
+          <w:rFonts w:eastAsia="맑은 고딕"/>
+        </w:rPr>
+        <w:t>※ 2단계는 접수 «후»에만 들어간다 — 문의번호·열쇠 없이 열면 「Missing inquiryId or token」.</w:t>
       </w:r>
     </w:p>
     <w:p>
@@ -2626,7 +2656,7 @@
       <w:r>
         <w:drawing>
           <wp:inline xmlns:a="http://schemas.openxmlformats.org/drawingml/2006/main" xmlns:pic="http://schemas.openxmlformats.org/drawingml/2006/picture">
-            <wp:extent cx="5760720" cy="4147718"/>
+            <wp:extent cx="5760720" cy="4378147"/>
             <wp:docPr id="3" name="Picture 3"/>
             <wp:cNvGraphicFramePr>
               <a:graphicFrameLocks noChangeAspect="1"/>
@@ -2647,7 +2677,7 @@
                   <pic:spPr>
                     <a:xfrm>
                       <a:off x="0" y="0"/>
-                      <a:ext cx="5760720" cy="4147718"/>
+                      <a:ext cx="5760720" cy="4378147"/>
                     </a:xfrm>
                     <a:prstGeom prst="rect"/>
                   </pic:spPr>
@@ -3077,7 +3107,7 @@
       <w:r>
         <w:drawing>
           <wp:inline xmlns:a="http://schemas.openxmlformats.org/drawingml/2006/main" xmlns:pic="http://schemas.openxmlformats.org/drawingml/2006/picture">
-            <wp:extent cx="5760720" cy="4147718"/>
+            <wp:extent cx="5760720" cy="4378147"/>
             <wp:docPr id="4" name="Picture 4"/>
             <wp:cNvGraphicFramePr>
               <a:graphicFrameLocks noChangeAspect="1"/>
@@ -3098,7 +3128,7 @@
                   <pic:spPr>
                     <a:xfrm>
                       <a:off x="0" y="0"/>
-                      <a:ext cx="5760720" cy="4147718"/>
+                      <a:ext cx="5760720" cy="4378147"/>
                     </a:xfrm>
                     <a:prstGeom prst="rect"/>
                   </pic:spPr>
@@ -3527,7 +3557,7 @@
       <w:r>
         <w:drawing>
           <wp:inline xmlns:a="http://schemas.openxmlformats.org/drawingml/2006/main" xmlns:pic="http://schemas.openxmlformats.org/drawingml/2006/picture">
-            <wp:extent cx="5760720" cy="4147718"/>
+            <wp:extent cx="5760720" cy="4378147"/>
             <wp:docPr id="5" name="Picture 5"/>
             <wp:cNvGraphicFramePr>
               <a:graphicFrameLocks noChangeAspect="1"/>
@@ -3548,7 +3578,7 @@
                   <pic:spPr>
                     <a:xfrm>
                       <a:off x="0" y="0"/>
-                      <a:ext cx="5760720" cy="4147718"/>
+                      <a:ext cx="5760720" cy="4378147"/>
                     </a:xfrm>
                     <a:prstGeom prst="rect"/>
                   </pic:spPr>
@@ -3963,7 +3993,7 @@
       <w:r>
         <w:drawing>
           <wp:inline xmlns:a="http://schemas.openxmlformats.org/drawingml/2006/main" xmlns:pic="http://schemas.openxmlformats.org/drawingml/2006/picture">
-            <wp:extent cx="5760720" cy="4147718"/>
+            <wp:extent cx="5760720" cy="4378147"/>
             <wp:docPr id="6" name="Picture 6"/>
             <wp:cNvGraphicFramePr>
               <a:graphicFrameLocks noChangeAspect="1"/>
@@ -3984,7 +4014,7 @@
                   <pic:spPr>
                     <a:xfrm>
                       <a:off x="0" y="0"/>
-                      <a:ext cx="5760720" cy="4147718"/>
+                      <a:ext cx="5760720" cy="4378147"/>
                     </a:xfrm>
                     <a:prstGeom prst="rect"/>
                   </pic:spPr>
@@ -4017,7 +4047,7 @@
           <w:sz w:val="18"/>
           <w:rFonts w:eastAsia="맑은 고딕"/>
         </w:rPr>
-        <w:t>· 왼쪽 메뉴 — 인박스·케이스·상담·견적·알림·전환 현황</w:t>
+        <w:t>· 왼쪽 메뉴 16개 — 인박스 · 케이스 · 문진 · 상담 · 대화 · 메시지 · 견적 · 비자 · 요청 · 알림 · 만족도 · 전환현황 · 파트너 · 콘텐츠 · 설정</w:t>
       </w:r>
     </w:p>
     <w:p>
@@ -4356,7 +4386,7 @@
       <w:r>
         <w:drawing>
           <wp:inline xmlns:a="http://schemas.openxmlformats.org/drawingml/2006/main" xmlns:pic="http://schemas.openxmlformats.org/drawingml/2006/picture">
-            <wp:extent cx="5760720" cy="4147718"/>
+            <wp:extent cx="5760720" cy="4378147"/>
             <wp:docPr id="7" name="Picture 7"/>
             <wp:cNvGraphicFramePr>
               <a:graphicFrameLocks noChangeAspect="1"/>
@@ -4377,7 +4407,7 @@
                   <pic:spPr>
                     <a:xfrm>
                       <a:off x="0" y="0"/>
-                      <a:ext cx="5760720" cy="4147718"/>
+                      <a:ext cx="5760720" cy="4378147"/>
                     </a:xfrm>
                     <a:prstGeom prst="rect"/>
                   </pic:spPr>
@@ -4559,7 +4589,7 @@
           <w:sz w:val="24"/>
           <w:rFonts w:eastAsia="맑은 고딕"/>
         </w:rPr>
-        <w:t>P-08. 사후관리 — 환자 포털</w:t>
+        <w:t>P-08. 사후관리 — 환자 화면</w:t>
       </w:r>
     </w:p>
     <w:tbl>
@@ -4677,7 +4707,7 @@
                 <w:sz w:val="18"/>
                 <w:rFonts w:eastAsia="맑은 고딕"/>
               </w:rPr>
-              <w:t>/portal</w:t>
+              <w:t>/patient  (로그인)</w:t>
             </w:r>
           </w:p>
         </w:tc>
@@ -4713,7 +4743,7 @@
                 <w:sz w:val="18"/>
                 <w:rFonts w:eastAsia="맑은 고딕"/>
               </w:rPr>
-              <w:t>환자(로그인)</w:t>
+              <w:t>환자</w:t>
             </w:r>
           </w:p>
         </w:tc>
@@ -4749,7 +4779,7 @@
                 <w:sz w:val="18"/>
                 <w:rFonts w:eastAsia="맑은 고딕"/>
               </w:rPr>
-              <w:t>귀국 후에도 한국 의료진과 끊기지 않게 경과를 주고받고, 재방문 시점을 놓치지 않게 한다.</w:t>
+              <w:t>귀국 뒤에도 한국 의료진과 끊기지 않게 경과를 주고받고, 재방문 시점을 놓치지 않게 한다.</w:t>
             </w:r>
           </w:p>
         </w:tc>
@@ -4763,7 +4793,7 @@
       <w:r>
         <w:drawing>
           <wp:inline xmlns:a="http://schemas.openxmlformats.org/drawingml/2006/main" xmlns:pic="http://schemas.openxmlformats.org/drawingml/2006/picture">
-            <wp:extent cx="5760720" cy="4147718"/>
+            <wp:extent cx="5760720" cy="4378147"/>
             <wp:docPr id="8" name="Picture 8"/>
             <wp:cNvGraphicFramePr>
               <a:graphicFrameLocks noChangeAspect="1"/>
@@ -4772,7 +4802,7 @@
               <a:graphicData uri="http://schemas.openxmlformats.org/drawingml/2006/picture">
                 <pic:pic>
                   <pic:nvPicPr>
-                    <pic:cNvPr id="0" name="P-08_portal.png"/>
+                    <pic:cNvPr id="0" name="P-08_patient.png"/>
                     <pic:cNvPicPr/>
                   </pic:nvPicPr>
                   <pic:blipFill>
@@ -4784,7 +4814,7 @@
                   <pic:spPr>
                     <a:xfrm>
                       <a:off x="0" y="0"/>
-                      <a:ext cx="5760720" cy="4147718"/>
+                      <a:ext cx="5760720" cy="4378147"/>
                     </a:xfrm>
                     <a:prstGeom prst="rect"/>
                   </pic:spPr>
@@ -4817,7 +4847,7 @@
           <w:sz w:val="18"/>
           <w:rFonts w:eastAsia="맑은 고딕"/>
         </w:rPr>
-        <w:t>· 오늘의 체크 — 증상·통증·체온·복약 여부</w:t>
+        <w:t>· 머리말 — 내 진행 상황 · 담당 코디네이터 · 다음 일정</w:t>
       </w:r>
     </w:p>
     <w:p>
@@ -4831,7 +4861,7 @@
           <w:sz w:val="18"/>
           <w:rFonts w:eastAsia="맑은 고딕"/>
         </w:rPr>
-        <w:t>· 다음 일정 — 1주·2주·1개월·3개월·6개월 자동 안내</w:t>
+        <w:t>· 카드 6종 — ①화상상담 ②서류 올리기(/patient/documents) ③교육 콘텐츠(/education) ④증상 기록(/patient/symptoms) ⑤재방문 상담(/patient/rebooking) ⑥비자(/visa)</w:t>
       </w:r>
     </w:p>
     <w:p>
@@ -4845,7 +4875,7 @@
           <w:sz w:val="18"/>
           <w:rFonts w:eastAsia="맑은 고딕"/>
         </w:rPr>
-        <w:t>· 검사 결과 올리기 — 현지 병원에서 받은 검사지·영상</w:t>
+        <w:t>· 뒤에서 도는 것 — AI가 증상 기록을 읽어 위험도를 산출하고 담당자에게 알린다</w:t>
       </w:r>
     </w:p>
     <w:p>
@@ -4859,49 +4889,7 @@
           <w:sz w:val="18"/>
           <w:rFonts w:eastAsia="맑은 고딕"/>
         </w:rPr>
-        <w:t>· 이상 징후 알림 — AI가 감지 → 담당 의료진에게 전달</w:t>
-      </w:r>
-    </w:p>
-    <w:p>
-      <w:pPr>
-        <w:ind w:left="283"/>
-      </w:pPr>
-      <w:r>
-        <w:rPr>
-          <w:rFonts w:ascii="맑은 고딕" w:hAnsi="맑은 고딕"/>
-          <w:b w:val="0"/>
-          <w:sz w:val="18"/>
-          <w:rFonts w:eastAsia="맑은 고딕"/>
-        </w:rPr>
-        <w:t>· 교육 콘텐츠 — 암 5종 식이·운동·복약·경고징후(6개 언어)</w:t>
-      </w:r>
-    </w:p>
-    <w:p>
-      <w:pPr>
-        <w:ind w:left="283"/>
-      </w:pPr>
-      <w:r>
-        <w:rPr>
-          <w:rFonts w:ascii="맑은 고딕" w:hAnsi="맑은 고딕"/>
-          <w:b w:val="0"/>
-          <w:sz w:val="18"/>
-          <w:rFonts w:eastAsia="맑은 고딕"/>
-        </w:rPr>
-        <w:t>· 재방문 상담 — 필요성 자동 판단 → 예상 비용·일정 안내</w:t>
-      </w:r>
-    </w:p>
-    <w:p>
-      <w:pPr>
-        <w:ind w:left="283"/>
-      </w:pPr>
-      <w:r>
-        <w:rPr>
-          <w:rFonts w:ascii="맑은 고딕" w:hAnsi="맑은 고딕"/>
-          <w:b w:val="0"/>
-          <w:sz w:val="18"/>
-          <w:rFonts w:eastAsia="맑은 고딕"/>
-        </w:rPr>
-        <w:t>· [남은 것] 단계별 자동 발송 — 귀국 후 시기에 맞춰 콘텐츠를 자동으로 보내는 부분</w:t>
+        <w:t>· [남은 것] 단계별 교육 자동 발송 — 귀국 후 시기에 맞춰 보내는 부분만 화면에 안 붙었다</w:t>
       </w:r>
     </w:p>
     <w:p>
@@ -4940,7 +4928,7 @@
           <w:sz w:val="18"/>
           <w:rFonts w:eastAsia="맑은 고딕"/>
         </w:rPr>
-        <w:t>· symptom_reports · followup_schedules — 기능은 서 있으나 실사용 데이터 0~1건</w:t>
+        <w:t>· symptom_reports 1건 · followup_schedules 0건 — 기능은 서 있으나 유치 확정 환자가 없어 실사용이 없다</w:t>
       </w:r>
     </w:p>
     <w:p>
@@ -4954,7 +4942,7 @@
           <w:sz w:val="18"/>
           <w:rFonts w:eastAsia="맑은 고딕"/>
         </w:rPr>
-        <w:t>· device_tokens 7건(푸시 알림 등록)</w:t>
+        <w:t>· device_tokens 7건(알림 등록)</w:t>
       </w:r>
     </w:p>
     <w:p>
@@ -5005,7 +4993,7 @@
           <w:sz w:val="18"/>
           <w:rFonts w:eastAsia="맑은 고딕"/>
         </w:rPr>
-        <w:t>※ 교육 콘텐츠는 /education 에서 6개 언어로 실제 열람된다(2026-08-19 실서비스 확인).</w:t>
+        <w:t>※ 주소는 /portal 이 아니라 /patient 다(2026-08-19 코드 확인). 카드는 실제 6종이다.</w:t>
       </w:r>
     </w:p>
     <w:p>
@@ -5020,7 +5008,37 @@
           <w:sz w:val="18"/>
           <w:rFonts w:eastAsia="맑은 고딕"/>
         </w:rPr>
-        <w:t>※ 나머지 칸은 기능이 서 있으나 유치 확정 환자가 없어 실사용 데이터가 0건이다 — 자동 완료 처리 등으로 실적을 부풀리는 방식은 채택하지 않는다.</w:t>
+        <w:t>※ 교육 콘텐츠는 환자 전용 화면이 아니라 공개 화면 /education 을 그대로 쓴다 — 6개 언어로 실서비스 중.</w:t>
+      </w:r>
+    </w:p>
+    <w:p>
+      <w:pPr>
+        <w:ind w:left="283"/>
+      </w:pPr>
+      <w:r>
+        <w:rPr>
+          <w:rFonts w:ascii="맑은 고딕" w:hAnsi="맑은 고딕"/>
+          <w:b w:val="0"/>
+          <w:color w:val="6E6E6E"/>
+          <w:sz w:val="18"/>
+          <w:rFonts w:eastAsia="맑은 고딕"/>
+        </w:rPr>
+        <w:t>※ 「이상 징후 알림」은 환자 화면의 칸이 아니라 뒤에서 도는 판정이다.</w:t>
+      </w:r>
+    </w:p>
+    <w:p>
+      <w:pPr>
+        <w:ind w:left="283"/>
+      </w:pPr>
+      <w:r>
+        <w:rPr>
+          <w:rFonts w:ascii="맑은 고딕" w:hAnsi="맑은 고딕"/>
+          <w:b w:val="0"/>
+          <w:color w:val="6E6E6E"/>
+          <w:sz w:val="18"/>
+          <w:rFonts w:eastAsia="맑은 고딕"/>
+        </w:rPr>
+        <w:t>※ 자동 완료 처리 등으로 실적을 부풀리는 방식은 채택하지 않는다.</w:t>
       </w:r>
     </w:p>
     <w:p>
@@ -5241,7 +5259,7 @@
       <w:r>
         <w:drawing>
           <wp:inline xmlns:a="http://schemas.openxmlformats.org/drawingml/2006/main" xmlns:pic="http://schemas.openxmlformats.org/drawingml/2006/picture">
-            <wp:extent cx="5760720" cy="4147718"/>
+            <wp:extent cx="5760720" cy="4378147"/>
             <wp:docPr id="9" name="Picture 9"/>
             <wp:cNvGraphicFramePr>
               <a:graphicFrameLocks noChangeAspect="1"/>
@@ -5262,7 +5280,7 @@
                   <pic:spPr>
                     <a:xfrm>
                       <a:off x="0" y="0"/>
-                      <a:ext cx="5760720" cy="4147718"/>
+                      <a:ext cx="5760720" cy="4378147"/>
                     </a:xfrm>
                     <a:prstGeom prst="rect"/>
                   </pic:spPr>
@@ -5295,7 +5313,7 @@
           <w:sz w:val="18"/>
           <w:rFonts w:eastAsia="맑은 고딕"/>
         </w:rPr>
-        <w:t>· 지표 카드 — 유치 · 사전상담+사후관리 · 만족도 · 다국어</w:t>
+        <w:t>· 기간 고르기 — 최근 30일 / 90일 / 1년 + 「시험 데이터 포함·제외」 스위치</w:t>
       </w:r>
     </w:p>
     <w:p>
@@ -5309,7 +5327,21 @@
           <w:sz w:val="18"/>
           <w:rFonts w:eastAsia="맑은 고딕"/>
         </w:rPr>
-        <w:t>· 유치 전환 깔때기 — 문의 → 사전상담 → 의뢰 → 방한 → 치료 → 사후관리</w:t>
+        <w:t>· 전환율 카드 3종 — 문의→사전상담 · 사전상담→유치 · 전체 유치율</w:t>
+      </w:r>
+    </w:p>
+    <w:p>
+      <w:pPr>
+        <w:ind w:left="283"/>
+      </w:pPr>
+      <w:r>
+        <w:rPr>
+          <w:rFonts w:ascii="맑은 고딕" w:hAnsi="맑은 고딕"/>
+          <w:b w:val="0"/>
+          <w:sz w:val="18"/>
+          <w:rFonts w:eastAsia="맑은 고딕"/>
+        </w:rPr>
+        <w:t>· 단계별 막대 — 문의 → 사전상담 → 의뢰 → 방한 → 치료 → 사후관리</w:t>
       </w:r>
     </w:p>
     <w:p>
@@ -5648,7 +5680,7 @@
       <w:r>
         <w:drawing>
           <wp:inline xmlns:a="http://schemas.openxmlformats.org/drawingml/2006/main" xmlns:pic="http://schemas.openxmlformats.org/drawingml/2006/picture">
-            <wp:extent cx="5760720" cy="4147718"/>
+            <wp:extent cx="5760720" cy="4378147"/>
             <wp:docPr id="10" name="Picture 10"/>
             <wp:cNvGraphicFramePr>
               <a:graphicFrameLocks noChangeAspect="1"/>
@@ -5669,7 +5701,7 @@
                   <pic:spPr>
                     <a:xfrm>
                       <a:off x="0" y="0"/>
-                      <a:ext cx="5760720" cy="4147718"/>
+                      <a:ext cx="5760720" cy="4378147"/>
                     </a:xfrm>
                     <a:prstGeom prst="rect"/>
                   </pic:spPr>

</xml_diff>

<commit_message>
chore: 작업 자동 저장 (2026-08-19 21:33)
</commit_message>
<xml_diff>
--- a/docs/government-project/01-1_화면설계서.docx
+++ b/docs/government-project/01-1_화면설계서.docx
@@ -1077,7 +1077,7 @@
                 <w:sz w:val="18"/>
                 <w:rFonts w:eastAsia="맑은 고딕"/>
               </w:rPr>
-              <w:t>코디네이터 인박스</w:t>
+              <w:t>코디네이터 인박스(문의함)</w:t>
             </w:r>
           </w:p>
         </w:tc>
@@ -1094,7 +1094,7 @@
                 <w:sz w:val="18"/>
                 <w:rFonts w:eastAsia="맑은 고딕"/>
               </w:rPr>
-              <w:t>/coordinator/inbox</w:t>
+              <w:t>/coordinator/inbox  (언어 앞자리 없음)</w:t>
             </w:r>
           </w:p>
         </w:tc>
@@ -1164,7 +1164,7 @@
                 <w:sz w:val="18"/>
                 <w:rFonts w:eastAsia="맑은 고딕"/>
               </w:rPr>
-              <w:t>케이스 상세 — 병원 의뢰</w:t>
+              <w:t>케이스 상세 — 문의 하나를 끝까지</w:t>
             </w:r>
           </w:p>
         </w:tc>
@@ -1181,7 +1181,7 @@
                 <w:sz w:val="18"/>
                 <w:rFonts w:eastAsia="맑은 고딕"/>
               </w:rPr>
-              <w:t>/coordinator/inbox/[id]</w:t>
+              <w:t>/coordinator/inbox/[번호]</w:t>
             </w:r>
           </w:p>
         </w:tc>
@@ -1251,7 +1251,7 @@
                 <w:sz w:val="18"/>
                 <w:rFonts w:eastAsia="맑은 고딕"/>
               </w:rPr>
-              <w:t>사후관리 — 환자 화면</w:t>
+              <w:t>사후관리 — 환자 화면(내 진료 관리)</w:t>
             </w:r>
           </w:p>
         </w:tc>
@@ -1338,7 +1338,7 @@
                 <w:sz w:val="18"/>
                 <w:rFonts w:eastAsia="맑은 고딕"/>
               </w:rPr>
-              <w:t>성과 대시보드</w:t>
+              <w:t>유치 전환 상세 (성과 대시보드)</w:t>
             </w:r>
           </w:p>
         </w:tc>
@@ -3789,7 +3789,7 @@
           <w:sz w:val="24"/>
           <w:rFonts w:eastAsia="맑은 고딕"/>
         </w:rPr>
-        <w:t>P-06. 코디네이터 인박스</w:t>
+        <w:t>P-06. 코디네이터 인박스(문의함)</w:t>
       </w:r>
     </w:p>
     <w:tbl>
@@ -3907,7 +3907,7 @@
                 <w:sz w:val="18"/>
                 <w:rFonts w:eastAsia="맑은 고딕"/>
               </w:rPr>
-              <w:t>/coordinator/inbox</w:t>
+              <w:t>/coordinator/inbox  (언어 앞자리 없음)</w:t>
             </w:r>
           </w:p>
         </w:tc>
@@ -3979,7 +3979,7 @@
                 <w:sz w:val="18"/>
                 <w:rFonts w:eastAsia="맑은 고딕"/>
               </w:rPr>
-              <w:t>들어온 문의를 한 곳에서 받고, 다음에 손댈 것을 놓치지 않게 한다.</w:t>
+              <w:t>들어온 문의를 한 곳에서 받고, 기준일을 넘긴 케이스를 눈에 띄게 해 다음에 손댈 것을 놓치지 않게 한다.</w:t>
             </w:r>
           </w:p>
         </w:tc>
@@ -4047,7 +4047,7 @@
           <w:sz w:val="18"/>
           <w:rFonts w:eastAsia="맑은 고딕"/>
         </w:rPr>
-        <w:t>· 왼쪽 메뉴 16개 — 인박스 · 케이스 · 문진 · 상담 · 대화 · 메시지 · 견적 · 비자 · 요청 · 알림 · 만족도 · 전환현황 · 파트너 · 콘텐츠 · 설정</w:t>
+        <w:t>· 왼쪽 메뉴 16개 — 대시보드 · 문의함 · AI 상담 리드 · 의뢰·케이스/병원배정 · 상담 일정 · 유치 전환 · 사후관리·만족도 · 파트너 발굴 · 메시지 · 비자 트래킹 · 견적 · 증상 알림 · 콘텐츠 편집 · 개선 요청함 · 설정</w:t>
       </w:r>
     </w:p>
     <w:p>
@@ -4061,7 +4061,7 @@
           <w:sz w:val="18"/>
           <w:rFonts w:eastAsia="맑은 고딕"/>
         </w:rPr>
-        <w:t>· 검색·필터 — 국적·암종·단계·담당자</w:t>
+        <w:t>· 거르기 세 갈래 — 전체 / 추가 정보 필요 / 매칭 준비 완료 (각 건수 표시)</w:t>
       </w:r>
     </w:p>
     <w:p>
@@ -4075,7 +4075,21 @@
           <w:sz w:val="18"/>
           <w:rFonts w:eastAsia="맑은 고딕"/>
         </w:rPr>
-        <w:t>· 목록 행 — 문의번호·국적/언어·암종·접수일·단계·담당 + 최근 활동 한 줄</w:t>
+        <w:t>· 목록 표 — 이름 | 국적 | 암종 | 연락방법 | Step 완료(1만 / 1+2) | 접수일 | 상태</w:t>
+      </w:r>
+    </w:p>
+    <w:p>
+      <w:pPr>
+        <w:ind w:left="283"/>
+      </w:pPr>
+      <w:r>
+        <w:rPr>
+          <w:rFonts w:ascii="맑은 고딕" w:hAnsi="맑은 고딕"/>
+          <w:b w:val="0"/>
+          <w:sz w:val="18"/>
+          <w:rFonts w:eastAsia="맑은 고딕"/>
+        </w:rPr>
+        <w:t>· 상태 칸에 빨간 배지 「N일째 정체」 — 단계 기준일을 넘긴 케이스를 표시</w:t>
       </w:r>
     </w:p>
     <w:p>
@@ -4100,7 +4114,7 @@
           <w:sz w:val="18"/>
           <w:rFonts w:eastAsia="맑은 고딕"/>
         </w:rPr>
-        <w:t>· inquiries + 시험 문의 자동 숨김</w:t>
+        <w:t>· inquiries — 목록에 실제로 뜬 건수 8건 = 실환자 8건(시험 문의는 자동으로 빠진다)</w:t>
       </w:r>
     </w:p>
     <w:p>
@@ -4165,6 +4179,21 @@
           <w:sz w:val="18"/>
           <w:rFonts w:eastAsia="맑은 고딕"/>
         </w:rPr>
+        <w:t>※ 로그인해서 실제로 확인(2026-08-19). 목록 열은 문의번호·담당자가 아니라 위 7가지다.</w:t>
+      </w:r>
+    </w:p>
+    <w:p>
+      <w:pPr>
+        <w:ind w:left="283"/>
+      </w:pPr>
+      <w:r>
+        <w:rPr>
+          <w:rFonts w:ascii="맑은 고딕" w:hAnsi="맑은 고딕"/>
+          <w:b w:val="0"/>
+          <w:color w:val="6E6E6E"/>
+          <w:sz w:val="18"/>
+          <w:rFonts w:eastAsia="맑은 고딕"/>
+        </w:rPr>
         <w:t>※ 시험 문의는 목록·알림·성과지표에서 모두 빠진다 — 실적 정직성 장치.</w:t>
       </w:r>
     </w:p>
@@ -4182,7 +4211,7 @@
           <w:sz w:val="24"/>
           <w:rFonts w:eastAsia="맑은 고딕"/>
         </w:rPr>
-        <w:t>P-07. 케이스 상세 — 병원 의뢰</w:t>
+        <w:t>P-07. 케이스 상세 — 문의 하나를 끝까지</w:t>
       </w:r>
     </w:p>
     <w:tbl>
@@ -4300,7 +4329,7 @@
                 <w:sz w:val="18"/>
                 <w:rFonts w:eastAsia="맑은 고딕"/>
               </w:rPr>
-              <w:t>/coordinator/inbox/[id]</w:t>
+              <w:t>/coordinator/inbox/[번호]</w:t>
             </w:r>
           </w:p>
         </w:tc>
@@ -4372,7 +4401,7 @@
                 <w:sz w:val="18"/>
                 <w:rFonts w:eastAsia="맑은 고딕"/>
               </w:rPr>
-              <w:t>환자 자료를 한국 의료진이 읽을 수 있는 형태로 만들어 대학병원에 의뢰하고, 회신을 되돌린다.</w:t>
+              <w:t>환자 자료를 한국 의료진이 읽을 수 있는 형태로 만들어 협진 병원에 의뢰하고, 받은 소견을 환자 언어로 되돌린다.</w:t>
             </w:r>
           </w:p>
         </w:tc>
@@ -4440,7 +4469,7 @@
           <w:sz w:val="18"/>
           <w:rFonts w:eastAsia="맑은 고딕"/>
         </w:rPr>
-        <w:t>· 환자 요약(케이스 브리프)</w:t>
+        <w:t>· 머리말 — 환자 이름 · 회원/비회원 · 담당자 · 문의 번호 · 접수 시각 · Step 완료 · 상태</w:t>
       </w:r>
     </w:p>
     <w:p>
@@ -4454,7 +4483,7 @@
           <w:sz w:val="18"/>
           <w:rFonts w:eastAsia="맑은 고딕"/>
         </w:rPr>
-        <w:t>· 자료 목록 + 한국어 번역본</w:t>
+        <w:t>· 케이스 브리프(AI 초안) — 환자 요약 · 원하는 것 · 「코디가 볼 포인트」 · 「주의」 + 「진단이 아니며 검수 필요」 고지</w:t>
       </w:r>
     </w:p>
     <w:p>
@@ -4468,7 +4497,7 @@
           <w:sz w:val="18"/>
           <w:rFonts w:eastAsia="맑은 고딕"/>
         </w:rPr>
-        <w:t>· 병원 의뢰 — 협진 병원 선택·의뢰서 발송</w:t>
+        <w:t>· 연락 정보 / 의료·여정 정보 / 문의 메시지 원문 / 추가 정보(인테이크)</w:t>
       </w:r>
     </w:p>
     <w:p>
@@ -4482,7 +4511,49 @@
           <w:sz w:val="18"/>
           <w:rFonts w:eastAsia="맑은 고딕"/>
         </w:rPr>
-        <w:t>· 회신 소견 등록·환자 전달</w:t>
+        <w:t>· 동의 항목 5종 — 개인정보 · 민감정보(건강) · 국경 간 이전 · 제3자(병원) 제공 · 마케팅(선택) + 동의 시각(KST) · 동의서 판번호</w:t>
+      </w:r>
+    </w:p>
+    <w:p>
+      <w:pPr>
+        <w:ind w:left="283"/>
+      </w:pPr>
+      <w:r>
+        <w:rPr>
+          <w:rFonts w:ascii="맑은 고딕" w:hAnsi="맑은 고딕"/>
+          <w:b w:val="0"/>
+          <w:sz w:val="18"/>
+          <w:rFonts w:eastAsia="맑은 고딕"/>
+        </w:rPr>
+        <w:t>· 첨부 서류 + [전부 받기] · 파일마다 [한] [EN] [RU] 변환 — AI 문서 번역 진입점</w:t>
+      </w:r>
+    </w:p>
+    <w:p>
+      <w:pPr>
+        <w:ind w:left="283"/>
+      </w:pPr>
+      <w:r>
+        <w:rPr>
+          <w:rFonts w:ascii="맑은 고딕" w:hAnsi="맑은 고딕"/>
+          <w:b w:val="0"/>
+          <w:sz w:val="18"/>
+          <w:rFonts w:eastAsia="맑은 고딕"/>
+        </w:rPr>
+        <w:t>· 환자 대신 서류 올리기 — PDF·이미지·Word 200MB / ZIP·RAR·DICOM 200MB</w:t>
+      </w:r>
+    </w:p>
+    <w:p>
+      <w:pPr>
+        <w:ind w:left="283"/>
+      </w:pPr>
+      <w:r>
+        <w:rPr>
+          <w:rFonts w:ascii="맑은 고딕" w:hAnsi="맑은 고딕"/>
+          <w:b w:val="0"/>
+          <w:sz w:val="18"/>
+          <w:rFonts w:eastAsia="맑은 고딕"/>
+        </w:rPr>
+        <w:t>· 전문의 소견 — [소견 요청 링크 만들기] · [이미 받은 소견 직접 입력] → 도착 소견 목록 → 환자 언어 자동 번역 초안 → 코디 교정 후 [에이전시에 공개]</w:t>
       </w:r>
     </w:p>
     <w:p>
@@ -4507,7 +4578,7 @@
           <w:sz w:val="18"/>
           <w:rFonts w:eastAsia="맑은 고딕"/>
         </w:rPr>
-        <w:t>· cotreatment_referrals 4건 · case_shared_documents 8건</w:t>
+        <w:t>· cotreatment_referrals 4건 · case_shared_documents 8건 · case_opinions 6건(전달 5건)</w:t>
       </w:r>
     </w:p>
     <w:p>
@@ -4521,7 +4592,7 @@
           <w:sz w:val="18"/>
           <w:rFonts w:eastAsia="맑은 고딕"/>
         </w:rPr>
-        <w:t>· attachment_translations — 러시아어 검사지 → 한국어 1:1 번역(숫자·단위·정상범위는 원문 그대로)</w:t>
+        <w:t>· attachment_translations 12건 — 외국 검사지를 표의 행·칸까지 구조화(숫자·단위·정상범위는 원문 그대로)</w:t>
       </w:r>
     </w:p>
     <w:p>
@@ -4572,6 +4643,21 @@
           <w:sz w:val="18"/>
           <w:rFonts w:eastAsia="맑은 고딕"/>
         </w:rPr>
+        <w:t>※ 로그인해서 실제로 확인(2026-08-19). 「접수 후 추가 정보」는 저장할 때 암호화된다.</w:t>
+      </w:r>
+    </w:p>
+    <w:p>
+      <w:pPr>
+        <w:ind w:left="283"/>
+      </w:pPr>
+      <w:r>
+        <w:rPr>
+          <w:rFonts w:ascii="맑은 고딕" w:hAnsi="맑은 고딕"/>
+          <w:b w:val="0"/>
+          <w:color w:val="6E6E6E"/>
+          <w:sz w:val="18"/>
+          <w:rFonts w:eastAsia="맑은 고딕"/>
+        </w:rPr>
         <w:t>※ 번역은 요약이 아니라 1:1 옮김이다 — 한국 의료진이 원본과 대조할 수 있어야 한다.</w:t>
       </w:r>
     </w:p>
@@ -4589,7 +4675,7 @@
           <w:sz w:val="24"/>
           <w:rFonts w:eastAsia="맑은 고딕"/>
         </w:rPr>
-        <w:t>P-08. 사후관리 — 환자 화면</w:t>
+        <w:t>P-08. 사후관리 — 환자 화면(내 진료 관리)</w:t>
       </w:r>
     </w:p>
     <w:tbl>
@@ -4847,7 +4933,7 @@
           <w:sz w:val="18"/>
           <w:rFonts w:eastAsia="맑은 고딕"/>
         </w:rPr>
-        <w:t>· 머리말 — 내 진행 상황 · 담당 코디네이터 · 다음 일정</w:t>
+        <w:t>· 인사말 + 알림 띠 「화상 상담 예약이 있습니다 · 날짜」 [대기실 입장]</w:t>
       </w:r>
     </w:p>
     <w:p>
@@ -4861,7 +4947,35 @@
           <w:sz w:val="18"/>
           <w:rFonts w:eastAsia="맑은 고딕"/>
         </w:rPr>
-        <w:t>· 카드 6종 — ①화상상담 ②서류 올리기(/patient/documents) ③교육 콘텐츠(/education) ④증상 기록(/patient/symptoms) ⑤재방문 상담(/patient/rebooking) ⑥비자(/visa)</w:t>
+        <w:t>· 빠른 메뉴 6종 — ①내 상담 ②의료 문서(/patient/documents) ③암 치료 가이드(/education) ④증상 기록(/patient/symptoms) ⑤재진 예약(/patient/rebooking) ⑥비자 가이드(/visa)</w:t>
+      </w:r>
+    </w:p>
+    <w:p>
+      <w:pPr>
+        <w:ind w:left="283"/>
+      </w:pPr>
+      <w:r>
+        <w:rPr>
+          <w:rFonts w:ascii="맑은 고딕" w:hAnsi="맑은 고딕"/>
+          <w:b w:val="0"/>
+          <w:sz w:val="18"/>
+          <w:rFonts w:eastAsia="맑은 고딕"/>
+        </w:rPr>
+        <w:t>· 내 문의 · 내 상담 목록 — 접수한 문의와 잡힌 상담이 이어서 표시</w:t>
+      </w:r>
+    </w:p>
+    <w:p>
+      <w:pPr>
+        <w:ind w:left="283"/>
+      </w:pPr>
+      <w:r>
+        <w:rPr>
+          <w:rFonts w:ascii="맑은 고딕" w:hAnsi="맑은 고딕"/>
+          <w:b w:val="0"/>
+          <w:sz w:val="18"/>
+          <w:rFonts w:eastAsia="맑은 고딕"/>
+        </w:rPr>
+        <w:t>· 휴대전화에서는 아래 고정 이동 막대(홈 · 의료 문서 · 더보기)</w:t>
       </w:r>
     </w:p>
     <w:p>
@@ -5055,7 +5169,7 @@
           <w:sz w:val="24"/>
           <w:rFonts w:eastAsia="맑은 고딕"/>
         </w:rPr>
-        <w:t>P-09. 성과 대시보드</w:t>
+        <w:t>P-09. 유치 전환 상세 (성과 대시보드)</w:t>
       </w:r>
     </w:p>
     <w:tbl>
@@ -5313,7 +5427,21 @@
           <w:sz w:val="18"/>
           <w:rFonts w:eastAsia="맑은 고딕"/>
         </w:rPr>
-        <w:t>· 기간 고르기 — 최근 30일 / 90일 / 1년 + 「시험 데이터 포함·제외」 스위치</w:t>
+        <w:t>· 기간 고르기 — 최근 30일 / 90일 / 1년 + 「실적만」 스위치(켜면 시험 데이터 제외)</w:t>
+      </w:r>
+    </w:p>
+    <w:p>
+      <w:pPr>
+        <w:ind w:left="283"/>
+      </w:pPr>
+      <w:r>
+        <w:rPr>
+          <w:rFonts w:ascii="맑은 고딕" w:hAnsi="맑은 고딕"/>
+          <w:b w:val="0"/>
+          <w:sz w:val="18"/>
+          <w:rFonts w:eastAsia="맑은 고딕"/>
+        </w:rPr>
+        <w:t>· 유치 깔때기 — 문의 접수 → 사전상담 완료 → 견적·비자 진행 → 유치 확정 → 사후관리 완료</w:t>
       </w:r>
     </w:p>
     <w:p>
@@ -5341,7 +5469,7 @@
           <w:sz w:val="18"/>
           <w:rFonts w:eastAsia="맑은 고딕"/>
         </w:rPr>
-        <w:t>· 단계별 막대 — 문의 → 사전상담 → 의뢰 → 방한 → 치료 → 사후관리</w:t>
+        <w:t>· 국가별 표 / 채널별(유입경로) 표 / 기관별 상담·사후관리 표</w:t>
       </w:r>
     </w:p>
     <w:p>
@@ -5355,21 +5483,7 @@
           <w:sz w:val="18"/>
           <w:rFonts w:eastAsia="맑은 고딕"/>
         </w:rPr>
-        <w:t>· 국가별 분포</w:t>
-      </w:r>
-    </w:p>
-    <w:p>
-      <w:pPr>
-        <w:ind w:left="283"/>
-      </w:pPr>
-      <w:r>
-        <w:rPr>
-          <w:rFonts w:ascii="맑은 고딕" w:hAnsi="맑은 고딕"/>
-          <w:b w:val="0"/>
-          <w:sz w:val="18"/>
-          <w:rFonts w:eastAsia="맑은 고딕"/>
-        </w:rPr>
-        <w:t>· 증빙 내려받기 — 월간·중간보고에 붙일 형태로 내보내기</w:t>
+        <w:t>· 유치 확정 대기 — [유치 확정] [이탈] [테스트로 표시] 로 결과를 코디가 입력</w:t>
       </w:r>
     </w:p>
     <w:p>
@@ -5394,7 +5508,7 @@
           <w:sz w:val="18"/>
           <w:rFonts w:eastAsia="맑은 고딕"/>
         </w:rPr>
-        <w:t>· kpi_snapshots 93건</w:t>
+        <w:t>· 2026-08-19 기준 — 문의 8 · 사전상담 완료 1(12.5%) · 유치 0 · 사후관리 0</w:t>
       </w:r>
     </w:p>
     <w:p>
@@ -5408,7 +5522,21 @@
           <w:sz w:val="18"/>
           <w:rFonts w:eastAsia="맑은 고딕"/>
         </w:rPr>
-        <w:t>· 목표값 단일 기준 파일 하나(화면과 문서가 어긋나지 않게)</w:t>
+        <w:t>· 국가별 KZ 5 · ET 1 · KG 1 · RU 1 / 채널별 웹 문의폼 6 · 소급등록 2</w:t>
+      </w:r>
+    </w:p>
+    <w:p>
+      <w:pPr>
+        <w:ind w:left="283"/>
+      </w:pPr>
+      <w:r>
+        <w:rPr>
+          <w:rFonts w:ascii="맑은 고딕" w:hAnsi="맑은 고딕"/>
+          <w:b w:val="0"/>
+          <w:sz w:val="18"/>
+          <w:rFonts w:eastAsia="맑은 고딕"/>
+        </w:rPr>
+        <w:t>· kpi_snapshots 93건 · 목표값 단일 기준 파일 하나(화면과 문서가 어긋나지 않게)</w:t>
       </w:r>
     </w:p>
     <w:p>
@@ -5459,7 +5587,37 @@
           <w:sz w:val="18"/>
           <w:rFonts w:eastAsia="맑은 고딕"/>
         </w:rPr>
-        <w:t>※ 시험 데이터는 집계에서 자동 제외되고, 집계 오류는 자동 경보가 잡는다.</w:t>
+        <w:t>※ 로그인해서 실제로 확인(2026-08-19). 화면 이름은 「유치 전환 상세」다.</w:t>
+      </w:r>
+    </w:p>
+    <w:p>
+      <w:pPr>
+        <w:ind w:left="283"/>
+      </w:pPr>
+      <w:r>
+        <w:rPr>
+          <w:rFonts w:ascii="맑은 고딕" w:hAnsi="맑은 고딕"/>
+          <w:b w:val="0"/>
+          <w:color w:val="6E6E6E"/>
+          <w:sz w:val="18"/>
+          <w:rFonts w:eastAsia="맑은 고딕"/>
+        </w:rPr>
+        <w:t>※ 깔때기의 사전상담(1)은 «문의에 연결된» 건, 기관별 표의 사전상담(3)은 전체 세션 — 세는 기준이 다르다.</w:t>
+      </w:r>
+    </w:p>
+    <w:p>
+      <w:pPr>
+        <w:ind w:left="283"/>
+      </w:pPr>
+      <w:r>
+        <w:rPr>
+          <w:rFonts w:ascii="맑은 고딕" w:hAnsi="맑은 고딕"/>
+          <w:b w:val="0"/>
+          <w:color w:val="6E6E6E"/>
+          <w:sz w:val="18"/>
+          <w:rFonts w:eastAsia="맑은 고딕"/>
+        </w:rPr>
+        <w:t>※ 시험 데이터는 「실적만」 스위치로 갈라 보며, 평가에 내는 숫자는 실적만이다.</w:t>
       </w:r>
     </w:p>
     <w:p>

</xml_diff>

<commit_message>
chore: 작업 자동 저장 (2026-08-20 10:45)
</commit_message>
<xml_diff>
--- a/docs/government-project/01-1_화면설계서.docx
+++ b/docs/government-project/01-1_화면설계서.docx
@@ -279,7 +279,7 @@
                 <w:sz w:val="18"/>
                 <w:rFonts w:eastAsia="맑은 고딕"/>
               </w:rPr>
-              <w:t>배포 코드·운영데이터베이스 실측(추정 없음)</w:t>
+              <w:t>배포 코드·운영데이터베이스 실측</w:t>
             </w:r>
           </w:p>
         </w:tc>
@@ -2162,7 +2162,7 @@
                 <w:sz w:val="18"/>
                 <w:rFonts w:eastAsia="맑은 고딕"/>
               </w:rPr>
-              <w:t>먼저 «연락하기 편한 방법»을 고르게 해 문턱을 낮추고, 신청서를 고른 사람만 폼으로 보낸다. 대학병원 의뢰에 필요한 자료는 접수 뒤 2단계에서 받는다.</w:t>
+              <w:t>먼저 「연락하기 편한 방법」을 고르게 해 문턱을 낮추고, 신청서를 고른 사람만 폼으로 보낸다. 대학병원 의뢰에 필요한 자료는 접수 뒤 2단계에서 받는다.</w:t>
             </w:r>
           </w:p>
         </w:tc>
@@ -2390,7 +2390,7 @@
           <w:sz w:val="18"/>
           <w:rFonts w:eastAsia="맑은 고딕"/>
         </w:rPr>
-        <w:t>※ /inquiry 는 폼이 아니라 «갈림길»이 먼저 나온다(2026-08-19 실서비스 확인).</w:t>
+        <w:t>※ /inquiry 는 폼이 아니라 「갈림길」이 먼저 나온다.</w:t>
       </w:r>
     </w:p>
     <w:p>
@@ -2405,7 +2405,7 @@
           <w:sz w:val="18"/>
           <w:rFonts w:eastAsia="맑은 고딕"/>
         </w:rPr>
-        <w:t>※ 2단계는 접수 «후»에만 들어간다 — 문의번호·열쇠 없이 열면 「Missing inquiryId or token」.</w:t>
+        <w:t>※ 2단계는 접수 후에만 들어간다 — 문의번호·열쇠 없이 열면 「Missing inquiryId or token」.</w:t>
       </w:r>
     </w:p>
     <w:p>
@@ -2886,7 +2886,7 @@
           <w:sz w:val="18"/>
           <w:rFonts w:eastAsia="맑은 고딕"/>
         </w:rPr>
-        <w:t>※ 채점은 실제로 문제를 잡아낸다 : 같은 기간 지어냄 5건·완치 표현 1건이 검출돼 개선에 반영됐다.</w:t>
+        <w:t>※ 같은 기간 검출 내역 — 지어냄 5건·완치 표현 1건(개선에 반영).</w:t>
       </w:r>
     </w:p>
     <w:p>
@@ -3757,22 +3757,7 @@
           <w:sz w:val="18"/>
           <w:rFonts w:eastAsia="맑은 고딕"/>
         </w:rPr>
-        <w:t>※ 화면에 글로 «다시 그리던» 소견 요약은 제거했다(2026-08-18) — 문서가 두 벌이 되어 혼선이 났다.</w:t>
-      </w:r>
-    </w:p>
-    <w:p>
-      <w:pPr>
-        <w:ind w:left="283"/>
-      </w:pPr>
-      <w:r>
-        <w:rPr>
-          <w:rFonts w:ascii="맑은 고딕" w:hAnsi="맑은 고딕"/>
-          <w:b w:val="0"/>
-          <w:color w:val="6E6E6E"/>
-          <w:sz w:val="18"/>
-          <w:rFonts w:eastAsia="맑은 고딕"/>
-        </w:rPr>
-        <w:t>※ 환자에게 «전달»한 시점이 성과지표 판정 기준이다. 작성만 하면 세지 않는다.</w:t>
+        <w:t>※ 환자에게 전달한 시점이 성과지표 판정 기준이다. 작성만 하면 세지 않는다.</w:t>
       </w:r>
     </w:p>
     <w:p>
@@ -4179,22 +4164,7 @@
           <w:sz w:val="18"/>
           <w:rFonts w:eastAsia="맑은 고딕"/>
         </w:rPr>
-        <w:t>※ 로그인해서 실제로 확인(2026-08-19). 목록 열은 문의번호·담당자가 아니라 위 7가지다.</w:t>
-      </w:r>
-    </w:p>
-    <w:p>
-      <w:pPr>
-        <w:ind w:left="283"/>
-      </w:pPr>
-      <w:r>
-        <w:rPr>
-          <w:rFonts w:ascii="맑은 고딕" w:hAnsi="맑은 고딕"/>
-          <w:b w:val="0"/>
-          <w:color w:val="6E6E6E"/>
-          <w:sz w:val="18"/>
-          <w:rFonts w:eastAsia="맑은 고딕"/>
-        </w:rPr>
-        <w:t>※ 시험 문의는 목록·알림·성과지표에서 모두 빠진다 — 실적 정직성 장치.</w:t>
+        <w:t>※ 시험 문의는 목록·알림·성과지표에서 모두 빠진다.</w:t>
       </w:r>
     </w:p>
     <w:p>
@@ -4643,7 +4613,7 @@
           <w:sz w:val="18"/>
           <w:rFonts w:eastAsia="맑은 고딕"/>
         </w:rPr>
-        <w:t>※ 로그인해서 실제로 확인(2026-08-19). 「접수 후 추가 정보」는 저장할 때 암호화된다.</w:t>
+        <w:t>※ 「접수 후 추가 정보」는 저장할 때 암호화된다.</w:t>
       </w:r>
     </w:p>
     <w:p>
@@ -5107,7 +5077,7 @@
           <w:sz w:val="18"/>
           <w:rFonts w:eastAsia="맑은 고딕"/>
         </w:rPr>
-        <w:t>※ 주소는 /portal 이 아니라 /patient 다(2026-08-19 코드 확인). 카드는 실제 6종이다.</w:t>
+        <w:t>※ 사후관리 카드는 6종이다.</w:t>
       </w:r>
     </w:p>
     <w:p>
@@ -5138,21 +5108,6 @@
           <w:rFonts w:eastAsia="맑은 고딕"/>
         </w:rPr>
         <w:t>※ 「이상 징후 알림」은 환자 화면의 칸이 아니라 뒤에서 도는 판정이다.</w:t>
-      </w:r>
-    </w:p>
-    <w:p>
-      <w:pPr>
-        <w:ind w:left="283"/>
-      </w:pPr>
-      <w:r>
-        <w:rPr>
-          <w:rFonts w:ascii="맑은 고딕" w:hAnsi="맑은 고딕"/>
-          <w:b w:val="0"/>
-          <w:color w:val="6E6E6E"/>
-          <w:sz w:val="18"/>
-          <w:rFonts w:eastAsia="맑은 고딕"/>
-        </w:rPr>
-        <w:t>※ 자동 완료 처리 등으로 실적을 부풀리는 방식은 채택하지 않는다.</w:t>
       </w:r>
     </w:p>
     <w:p>
@@ -5587,7 +5542,7 @@
           <w:sz w:val="18"/>
           <w:rFonts w:eastAsia="맑은 고딕"/>
         </w:rPr>
-        <w:t>※ 로그인해서 실제로 확인(2026-08-19). 화면 이름은 「유치 전환 상세」다.</w:t>
+        <w:t>※ 깔때기의 사전상담(1)은 문의에 연결된 건, 기관별 표의 사전상담(3)은 전체 세션 — 세는 기준이 다르다.</w:t>
       </w:r>
     </w:p>
     <w:p>
@@ -5602,22 +5557,7 @@
           <w:sz w:val="18"/>
           <w:rFonts w:eastAsia="맑은 고딕"/>
         </w:rPr>
-        <w:t>※ 깔때기의 사전상담(1)은 «문의에 연결된» 건, 기관별 표의 사전상담(3)은 전체 세션 — 세는 기준이 다르다.</w:t>
-      </w:r>
-    </w:p>
-    <w:p>
-      <w:pPr>
-        <w:ind w:left="283"/>
-      </w:pPr>
-      <w:r>
-        <w:rPr>
-          <w:rFonts w:ascii="맑은 고딕" w:hAnsi="맑은 고딕"/>
-          <w:b w:val="0"/>
-          <w:color w:val="6E6E6E"/>
-          <w:sz w:val="18"/>
-          <w:rFonts w:eastAsia="맑은 고딕"/>
-        </w:rPr>
-        <w:t>※ 시험 데이터는 「실적만」 스위치로 갈라 보며, 평가에 내는 숫자는 실적만이다.</w:t>
+        <w:t>※ 시험 데이터는 「실적만」 스위치로 갈라 본다.</w:t>
       </w:r>
     </w:p>
     <w:p>

</xml_diff>

<commit_message>
chore: 작업 자동 저장 (2026-08-20 10:55)
</commit_message>
<xml_diff>
--- a/docs/government-project/01-1_화면설계서.docx
+++ b/docs/government-project/01-1_화면설계서.docx
@@ -2805,7 +2805,7 @@
           <w:sz w:val="18"/>
           <w:rFonts w:eastAsia="맑은 고딕"/>
         </w:rPr>
-        <w:t>· ai_response_evaluations 462건 · ai_regression_runs 2,212회(품질 자동 채점)</w:t>
+        <w:t>· ai_response_evaluations · ai_regression_runs — 품질 자동 시험 기록</w:t>
       </w:r>
     </w:p>
     <w:p>
@@ -2871,22 +2871,7 @@
           <w:sz w:val="18"/>
           <w:rFonts w:eastAsia="맑은 고딕"/>
         </w:rPr>
-        <w:t>※ 품질은 매일 자동 채점된다 — 최근 30일 1,332회 · 통과 95.5%.</w:t>
-      </w:r>
-    </w:p>
-    <w:p>
-      <w:pPr>
-        <w:ind w:left="283"/>
-      </w:pPr>
-      <w:r>
-        <w:rPr>
-          <w:rFonts w:ascii="맑은 고딕" w:hAnsi="맑은 고딕"/>
-          <w:b w:val="0"/>
-          <w:color w:val="6E6E6E"/>
-          <w:sz w:val="18"/>
-          <w:rFonts w:eastAsia="맑은 고딕"/>
-        </w:rPr>
-        <w:t>※ 같은 기간 검출 내역 — 지어냄 5건·완치 표현 1건(개선에 반영).</w:t>
+        <w:t>※ 품질은 매일 자동 시험한다 — 의료 레드라인(완치 단정·지어낸 병원) 위반을 검출해 경보한다.</w:t>
       </w:r>
     </w:p>
     <w:p>

</xml_diff>

<commit_message>
chore: 작업 자동 저장 (2026-08-20 16:58)
</commit_message>
<xml_diff>
--- a/docs/government-project/01-1_화면설계서.docx
+++ b/docs/government-project/01-1_화면설계서.docx
@@ -1496,7 +1496,74 @@
           <w:sz w:val="28"/>
           <w:rFonts w:eastAsia="맑은 고딕"/>
         </w:rPr>
-        <w:t>2. 화면별 상세</w:t>
+        <w:t>2. 시스템 구성도</w:t>
+      </w:r>
+    </w:p>
+    <w:p>
+      <w:r>
+        <w:rPr>
+          <w:rFonts w:ascii="맑은 고딕" w:hAnsi="맑은 고딕"/>
+          <w:b w:val="0"/>
+          <w:sz w:val="20"/>
+          <w:rFonts w:eastAsia="맑은 고딕"/>
+        </w:rPr>
+        <w:t>이용자부터 데이터 보관까지 플랫폼 전체가 어떻게 이어지는지 한 장으로 보인다. 점선 상자는 바깥 서비스이고 나머지는 직접 만들어 운영한다.</w:t>
+      </w:r>
+    </w:p>
+    <w:p>
+      <w:pPr>
+        <w:jc w:val="center"/>
+      </w:pPr>
+      <w:r>
+        <w:drawing>
+          <wp:inline xmlns:a="http://schemas.openxmlformats.org/drawingml/2006/main" xmlns:pic="http://schemas.openxmlformats.org/drawingml/2006/picture">
+            <wp:extent cx="5760720" cy="4378147"/>
+            <wp:docPr id="1" name="Picture 1"/>
+            <wp:cNvGraphicFramePr>
+              <a:graphicFrameLocks noChangeAspect="1"/>
+            </wp:cNvGraphicFramePr>
+            <a:graphic>
+              <a:graphicData uri="http://schemas.openxmlformats.org/drawingml/2006/picture">
+                <pic:pic>
+                  <pic:nvPicPr>
+                    <pic:cNvPr id="0" name="S-01_architecture.png"/>
+                    <pic:cNvPicPr/>
+                  </pic:nvPicPr>
+                  <pic:blipFill>
+                    <a:blip r:embed="rId9"/>
+                    <a:stretch>
+                      <a:fillRect/>
+                    </a:stretch>
+                  </pic:blipFill>
+                  <pic:spPr>
+                    <a:xfrm>
+                      <a:off x="0" y="0"/>
+                      <a:ext cx="5760720" cy="4378147"/>
+                    </a:xfrm>
+                    <a:prstGeom prst="rect"/>
+                  </pic:spPr>
+                </pic:pic>
+              </a:graphicData>
+            </a:graphic>
+          </wp:inline>
+        </w:drawing>
+      </w:r>
+    </w:p>
+    <w:p>
+      <w:r>
+        <w:br w:type="page"/>
+      </w:r>
+    </w:p>
+    <w:p>
+      <w:r>
+        <w:rPr>
+          <w:rFonts w:ascii="맑은 고딕" w:hAnsi="맑은 고딕"/>
+          <w:b/>
+          <w:color w:val="00467F"/>
+          <w:sz w:val="28"/>
+          <w:rFonts w:eastAsia="맑은 고딕"/>
+        </w:rPr>
+        <w:t>3. 화면별 상세</w:t>
       </w:r>
     </w:p>
     <w:p>
@@ -1713,7 +1780,7 @@
         <w:drawing>
           <wp:inline xmlns:a="http://schemas.openxmlformats.org/drawingml/2006/main" xmlns:pic="http://schemas.openxmlformats.org/drawingml/2006/picture">
             <wp:extent cx="5760720" cy="4378147"/>
-            <wp:docPr id="1" name="Picture 1"/>
+            <wp:docPr id="2" name="Picture 2"/>
             <wp:cNvGraphicFramePr>
               <a:graphicFrameLocks noChangeAspect="1"/>
             </wp:cNvGraphicFramePr>
@@ -1725,7 +1792,7 @@
                     <pic:cNvPicPr/>
                   </pic:nvPicPr>
                   <pic:blipFill>
-                    <a:blip r:embed="rId9"/>
+                    <a:blip r:embed="rId10"/>
                     <a:stretch>
                       <a:fillRect/>
                     </a:stretch>
@@ -2177,7 +2244,7 @@
         <w:drawing>
           <wp:inline xmlns:a="http://schemas.openxmlformats.org/drawingml/2006/main" xmlns:pic="http://schemas.openxmlformats.org/drawingml/2006/picture">
             <wp:extent cx="5760720" cy="4378147"/>
-            <wp:docPr id="2" name="Picture 2"/>
+            <wp:docPr id="3" name="Picture 3"/>
             <wp:cNvGraphicFramePr>
               <a:graphicFrameLocks noChangeAspect="1"/>
             </wp:cNvGraphicFramePr>
@@ -2189,7 +2256,7 @@
                     <pic:cNvPicPr/>
                   </pic:nvPicPr>
                   <pic:blipFill>
-                    <a:blip r:embed="rId10"/>
+                    <a:blip r:embed="rId11"/>
                     <a:stretch>
                       <a:fillRect/>
                     </a:stretch>
@@ -2657,7 +2724,7 @@
         <w:drawing>
           <wp:inline xmlns:a="http://schemas.openxmlformats.org/drawingml/2006/main" xmlns:pic="http://schemas.openxmlformats.org/drawingml/2006/picture">
             <wp:extent cx="5760720" cy="4378147"/>
-            <wp:docPr id="3" name="Picture 3"/>
+            <wp:docPr id="4" name="Picture 4"/>
             <wp:cNvGraphicFramePr>
               <a:graphicFrameLocks noChangeAspect="1"/>
             </wp:cNvGraphicFramePr>
@@ -2669,7 +2736,7 @@
                     <pic:cNvPicPr/>
                   </pic:nvPicPr>
                   <pic:blipFill>
-                    <a:blip r:embed="rId11"/>
+                    <a:blip r:embed="rId12"/>
                     <a:stretch>
                       <a:fillRect/>
                     </a:stretch>
@@ -3093,7 +3160,7 @@
         <w:drawing>
           <wp:inline xmlns:a="http://schemas.openxmlformats.org/drawingml/2006/main" xmlns:pic="http://schemas.openxmlformats.org/drawingml/2006/picture">
             <wp:extent cx="5760720" cy="4378147"/>
-            <wp:docPr id="4" name="Picture 4"/>
+            <wp:docPr id="5" name="Picture 5"/>
             <wp:cNvGraphicFramePr>
               <a:graphicFrameLocks noChangeAspect="1"/>
             </wp:cNvGraphicFramePr>
@@ -3105,7 +3172,7 @@
                     <pic:cNvPicPr/>
                   </pic:nvPicPr>
                   <pic:blipFill>
-                    <a:blip r:embed="rId12"/>
+                    <a:blip r:embed="rId13"/>
                     <a:stretch>
                       <a:fillRect/>
                     </a:stretch>
@@ -3543,7 +3610,7 @@
         <w:drawing>
           <wp:inline xmlns:a="http://schemas.openxmlformats.org/drawingml/2006/main" xmlns:pic="http://schemas.openxmlformats.org/drawingml/2006/picture">
             <wp:extent cx="5760720" cy="4378147"/>
-            <wp:docPr id="5" name="Picture 5"/>
+            <wp:docPr id="6" name="Picture 6"/>
             <wp:cNvGraphicFramePr>
               <a:graphicFrameLocks noChangeAspect="1"/>
             </wp:cNvGraphicFramePr>
@@ -3555,7 +3622,7 @@
                     <pic:cNvPicPr/>
                   </pic:nvPicPr>
                   <pic:blipFill>
-                    <a:blip r:embed="rId13"/>
+                    <a:blip r:embed="rId14"/>
                     <a:stretch>
                       <a:fillRect/>
                     </a:stretch>
@@ -3964,7 +4031,7 @@
         <w:drawing>
           <wp:inline xmlns:a="http://schemas.openxmlformats.org/drawingml/2006/main" xmlns:pic="http://schemas.openxmlformats.org/drawingml/2006/picture">
             <wp:extent cx="5760720" cy="4378147"/>
-            <wp:docPr id="6" name="Picture 6"/>
+            <wp:docPr id="7" name="Picture 7"/>
             <wp:cNvGraphicFramePr>
               <a:graphicFrameLocks noChangeAspect="1"/>
             </wp:cNvGraphicFramePr>
@@ -3976,7 +4043,7 @@
                     <pic:cNvPicPr/>
                   </pic:nvPicPr>
                   <pic:blipFill>
-                    <a:blip r:embed="rId14"/>
+                    <a:blip r:embed="rId15"/>
                     <a:stretch>
                       <a:fillRect/>
                     </a:stretch>
@@ -4371,7 +4438,7 @@
         <w:drawing>
           <wp:inline xmlns:a="http://schemas.openxmlformats.org/drawingml/2006/main" xmlns:pic="http://schemas.openxmlformats.org/drawingml/2006/picture">
             <wp:extent cx="5760720" cy="4378147"/>
-            <wp:docPr id="7" name="Picture 7"/>
+            <wp:docPr id="8" name="Picture 8"/>
             <wp:cNvGraphicFramePr>
               <a:graphicFrameLocks noChangeAspect="1"/>
             </wp:cNvGraphicFramePr>
@@ -4383,7 +4450,7 @@
                     <pic:cNvPicPr/>
                   </pic:nvPicPr>
                   <pic:blipFill>
-                    <a:blip r:embed="rId15"/>
+                    <a:blip r:embed="rId16"/>
                     <a:stretch>
                       <a:fillRect/>
                     </a:stretch>
@@ -4835,7 +4902,7 @@
         <w:drawing>
           <wp:inline xmlns:a="http://schemas.openxmlformats.org/drawingml/2006/main" xmlns:pic="http://schemas.openxmlformats.org/drawingml/2006/picture">
             <wp:extent cx="5760720" cy="4378147"/>
-            <wp:docPr id="8" name="Picture 8"/>
+            <wp:docPr id="9" name="Picture 9"/>
             <wp:cNvGraphicFramePr>
               <a:graphicFrameLocks noChangeAspect="1"/>
             </wp:cNvGraphicFramePr>
@@ -4847,7 +4914,7 @@
                     <pic:cNvPicPr/>
                   </pic:nvPicPr>
                   <pic:blipFill>
-                    <a:blip r:embed="rId16"/>
+                    <a:blip r:embed="rId17"/>
                     <a:stretch>
                       <a:fillRect/>
                     </a:stretch>
@@ -5314,7 +5381,7 @@
         <w:drawing>
           <wp:inline xmlns:a="http://schemas.openxmlformats.org/drawingml/2006/main" xmlns:pic="http://schemas.openxmlformats.org/drawingml/2006/picture">
             <wp:extent cx="5760720" cy="4378147"/>
-            <wp:docPr id="9" name="Picture 9"/>
+            <wp:docPr id="10" name="Picture 10"/>
             <wp:cNvGraphicFramePr>
               <a:graphicFrameLocks noChangeAspect="1"/>
             </wp:cNvGraphicFramePr>
@@ -5326,7 +5393,7 @@
                     <pic:cNvPicPr/>
                   </pic:nvPicPr>
                   <pic:blipFill>
-                    <a:blip r:embed="rId17"/>
+                    <a:blip r:embed="rId18"/>
                     <a:stretch>
                       <a:fillRect/>
                     </a:stretch>
@@ -5764,7 +5831,7 @@
         <w:drawing>
           <wp:inline xmlns:a="http://schemas.openxmlformats.org/drawingml/2006/main" xmlns:pic="http://schemas.openxmlformats.org/drawingml/2006/picture">
             <wp:extent cx="5760720" cy="4378147"/>
-            <wp:docPr id="10" name="Picture 10"/>
+            <wp:docPr id="11" name="Picture 11"/>
             <wp:cNvGraphicFramePr>
               <a:graphicFrameLocks noChangeAspect="1"/>
             </wp:cNvGraphicFramePr>
@@ -5776,7 +5843,7 @@
                     <pic:cNvPicPr/>
                   </pic:nvPicPr>
                   <pic:blipFill>
-                    <a:blip r:embed="rId18"/>
+                    <a:blip r:embed="rId19"/>
                     <a:stretch>
                       <a:fillRect/>
                     </a:stretch>

</xml_diff>

<commit_message>
chore: 작업 자동 저장 (2026-08-20 17:23)
</commit_message>
<xml_diff>
--- a/docs/government-project/01-1_화면설계서.docx
+++ b/docs/government-project/01-1_화면설계서.docx
@@ -1517,7 +1517,7 @@
       <w:r>
         <w:drawing>
           <wp:inline xmlns:a="http://schemas.openxmlformats.org/drawingml/2006/main" xmlns:pic="http://schemas.openxmlformats.org/drawingml/2006/picture">
-            <wp:extent cx="5760720" cy="4378147"/>
+            <wp:extent cx="5760720" cy="4393769"/>
             <wp:docPr id="1" name="Picture 1"/>
             <wp:cNvGraphicFramePr>
               <a:graphicFrameLocks noChangeAspect="1"/>
@@ -1538,7 +1538,7 @@
                   <pic:spPr>
                     <a:xfrm>
                       <a:off x="0" y="0"/>
-                      <a:ext cx="5760720" cy="4378147"/>
+                      <a:ext cx="5760720" cy="4393769"/>
                     </a:xfrm>
                     <a:prstGeom prst="rect"/>
                   </pic:spPr>

</xml_diff>

<commit_message>
chore: 작업 자동 저장 (2026-08-20 17:27)
</commit_message>
<xml_diff>
--- a/docs/government-project/01-1_화면설계서.docx
+++ b/docs/government-project/01-1_화면설계서.docx
@@ -1517,7 +1517,7 @@
       <w:r>
         <w:drawing>
           <wp:inline xmlns:a="http://schemas.openxmlformats.org/drawingml/2006/main" xmlns:pic="http://schemas.openxmlformats.org/drawingml/2006/picture">
-            <wp:extent cx="5760720" cy="4393769"/>
+            <wp:extent cx="5760720" cy="3240405"/>
             <wp:docPr id="1" name="Picture 1"/>
             <wp:cNvGraphicFramePr>
               <a:graphicFrameLocks noChangeAspect="1"/>
@@ -1538,7 +1538,7 @@
                   <pic:spPr>
                     <a:xfrm>
                       <a:off x="0" y="0"/>
-                      <a:ext cx="5760720" cy="4393769"/>
+                      <a:ext cx="5760720" cy="3240405"/>
                     </a:xfrm>
                     <a:prstGeom prst="rect"/>
                   </pic:spPr>

</xml_diff>

<commit_message>
chore: 작업 자동 저장 (2026-08-20 17:33)
</commit_message>
<xml_diff>
--- a/docs/government-project/01-1_화면설계서.docx
+++ b/docs/government-project/01-1_화면설계서.docx
@@ -1488,6 +1488,16 @@
       </w:r>
     </w:p>
     <w:p>
+      <w:pPr>
+        <w:sectPr>
+          <w:pgSz w:w="11909" w:h="16834"/>
+          <w:pgMar w:top="1134" w:right="1134" w:bottom="1134" w:left="1134" w:header="720" w:footer="720" w:gutter="0"/>
+          <w:cols w:space="720"/>
+          <w:docGrid w:linePitch="360"/>
+        </w:sectPr>
+      </w:pPr>
+    </w:p>
+    <w:p>
       <w:r>
         <w:rPr>
           <w:rFonts w:ascii="맑은 고딕" w:hAnsi="맑은 고딕"/>
@@ -1517,7 +1527,7 @@
       <w:r>
         <w:drawing>
           <wp:inline xmlns:a="http://schemas.openxmlformats.org/drawingml/2006/main" xmlns:pic="http://schemas.openxmlformats.org/drawingml/2006/picture">
-            <wp:extent cx="5760720" cy="3240405"/>
+            <wp:extent cx="9509760" cy="5349240"/>
             <wp:docPr id="1" name="Picture 1"/>
             <wp:cNvGraphicFramePr>
               <a:graphicFrameLocks noChangeAspect="1"/>
@@ -1538,7 +1548,7 @@
                   <pic:spPr>
                     <a:xfrm>
                       <a:off x="0" y="0"/>
-                      <a:ext cx="5760720" cy="3240405"/>
+                      <a:ext cx="9509760" cy="5349240"/>
                     </a:xfrm>
                     <a:prstGeom prst="rect"/>
                   </pic:spPr>
@@ -1550,9 +1560,14 @@
       </w:r>
     </w:p>
     <w:p>
-      <w:r>
-        <w:br w:type="page"/>
-      </w:r>
+      <w:pPr>
+        <w:sectPr>
+          <w:pgSz w:w="16834" w:h="11909" w:orient="landscape"/>
+          <w:pgMar w:top="850" w:right="850" w:bottom="850" w:left="850" w:header="720" w:footer="720" w:gutter="0"/>
+          <w:cols w:space="720"/>
+          <w:docGrid w:linePitch="360"/>
+        </w:sectPr>
+      </w:pPr>
     </w:p>
     <w:p>
       <w:r>

</xml_diff>

<commit_message>
chore: 작업 자동 저장 (2026-08-20 17:50)
</commit_message>
<xml_diff>
--- a/docs/government-project/01-1_화면설계서.docx
+++ b/docs/government-project/01-1_화면설계서.docx
@@ -1490,6 +1490,12 @@
     <w:p>
       <w:pPr>
         <w:sectPr>
+          <w:headerReference w:type="default" r:id="rId20"/>
+          <w:footerReference w:type="default" r:id="rId21"/>
+          <w:headerReference w:type="first" r:id="rId22"/>
+          <w:footerReference w:type="first" r:id="rId23"/>
+          <w:headerReference w:type="even" r:id="rId24"/>
+          <w:footerReference w:type="even" r:id="rId25"/>
           <w:pgSz w:w="11909" w:h="16834"/>
           <w:pgMar w:top="1134" w:right="1134" w:bottom="1134" w:left="1134" w:header="720" w:footer="720" w:gutter="0"/>
           <w:cols w:space="720"/>
@@ -1562,6 +1568,7 @@
     <w:p>
       <w:pPr>
         <w:sectPr>
+          <w:footerReference w:type="default" r:id="rId26"/>
           <w:pgSz w:w="16834" w:h="11909" w:orient="landscape"/>
           <w:pgMar w:top="850" w:right="850" w:bottom="850" w:left="850" w:header="720" w:footer="720" w:gutter="0"/>
           <w:cols w:space="720"/>
@@ -6852,6 +6859,7 @@
       </w:tr>
     </w:tbl>
     <w:sectPr>
+      <w:footerReference w:type="default" r:id="rId27"/>
       <w:pgSz w:w="11909" w:h="16834"/>
       <w:pgMar w:top="1134" w:right="1134" w:bottom="1134" w:left="1134" w:header="720" w:footer="720" w:gutter="0"/>
       <w:cols w:space="720"/>
@@ -6859,6 +6867,329 @@
     </w:sectPr>
   </w:body>
 </w:document>
+</file>
+
+<file path=word/footer1.xml><?xml version="1.0" encoding="utf-8"?>
+<w:ftr xmlns:m="http://schemas.openxmlformats.org/officeDocument/2006/math" xmlns:mc="http://schemas.openxmlformats.org/markup-compatibility/2006" xmlns:mo="http://schemas.microsoft.com/office/mac/office/2008/main" xmlns:mv="urn:schemas-microsoft-com:mac:vml" xmlns:o="urn:schemas-microsoft-com:office:office" xmlns:r="http://schemas.openxmlformats.org/officeDocument/2006/relationships" xmlns:v="urn:schemas-microsoft-com:vml" xmlns:w10="urn:schemas-microsoft-com:office:word" xmlns:w14="http://schemas.microsoft.com/office/word/2010/wordml" xmlns:w="http://schemas.openxmlformats.org/wordprocessingml/2006/main" xmlns:wne="http://schemas.microsoft.com/office/word/2006/wordml" xmlns:wp14="http://schemas.microsoft.com/office/word/2010/wordprocessingDrawing" xmlns:wp="http://schemas.openxmlformats.org/drawingml/2006/wordprocessingDrawing" xmlns:wpc="http://schemas.microsoft.com/office/word/2010/wordprocessingCanvas" xmlns:wpg="http://schemas.microsoft.com/office/word/2010/wordprocessingGroup" xmlns:wpi="http://schemas.microsoft.com/office/word/2010/wordprocessingInk" xmlns:wps="http://schemas.microsoft.com/office/word/2010/wordprocessingShape" mc:Ignorable="w14 wp14">
+  <w:p>
+    <w:pPr>
+      <w:pStyle w:val="Footer"/>
+      <w:jc w:val="center"/>
+    </w:pPr>
+    <w:r>
+      <w:rPr>
+        <w:rFonts w:ascii="맑은 고딕" w:hAnsi="맑은 고딕"/>
+        <w:b w:val="0"/>
+        <w:color w:val="787878"/>
+        <w:sz w:val="16"/>
+        <w:rFonts w:eastAsia="맑은 고딕"/>
+      </w:rPr>
+      <w:t xml:space="preserve">본로이  |  기밀문서, 무단 배포 금지     </w:t>
+    </w:r>
+    <w:r>
+      <w:rPr>
+        <w:rFonts w:ascii="맑은 고딕" w:hAnsi="맑은 고딕"/>
+        <w:b w:val="0"/>
+        <w:color w:val="787878"/>
+        <w:sz w:val="16"/>
+        <w:rFonts w:eastAsia="맑은 고딕"/>
+      </w:rPr>
+      <w:fldChar w:fldCharType="begin"/>
+    </w:r>
+    <w:r>
+      <w:rPr>
+        <w:rFonts w:ascii="맑은 고딕" w:hAnsi="맑은 고딕"/>
+        <w:b w:val="0"/>
+        <w:color w:val="787878"/>
+        <w:sz w:val="16"/>
+        <w:rFonts w:eastAsia="맑은 고딕"/>
+      </w:rPr>
+      <w:instrText xml:space="preserve"> PAGE </w:instrText>
+    </w:r>
+    <w:r>
+      <w:rPr>
+        <w:rFonts w:ascii="맑은 고딕" w:hAnsi="맑은 고딕"/>
+        <w:b w:val="0"/>
+        <w:color w:val="787878"/>
+        <w:sz w:val="16"/>
+        <w:rFonts w:eastAsia="맑은 고딕"/>
+      </w:rPr>
+      <w:fldChar w:fldCharType="end"/>
+    </w:r>
+    <w:r>
+      <w:rPr>
+        <w:rFonts w:ascii="맑은 고딕" w:hAnsi="맑은 고딕"/>
+        <w:b w:val="0"/>
+        <w:color w:val="787878"/>
+        <w:sz w:val="16"/>
+        <w:rFonts w:eastAsia="맑은 고딕"/>
+      </w:rPr>
+      <w:t xml:space="preserve"> / </w:t>
+    </w:r>
+    <w:r>
+      <w:rPr>
+        <w:rFonts w:ascii="맑은 고딕" w:hAnsi="맑은 고딕"/>
+        <w:b w:val="0"/>
+        <w:color w:val="787878"/>
+        <w:sz w:val="16"/>
+        <w:rFonts w:eastAsia="맑은 고딕"/>
+      </w:rPr>
+      <w:fldChar w:fldCharType="begin"/>
+    </w:r>
+    <w:r>
+      <w:rPr>
+        <w:rFonts w:ascii="맑은 고딕" w:hAnsi="맑은 고딕"/>
+        <w:b w:val="0"/>
+        <w:color w:val="787878"/>
+        <w:sz w:val="16"/>
+        <w:rFonts w:eastAsia="맑은 고딕"/>
+      </w:rPr>
+      <w:instrText xml:space="preserve"> NUMPAGES </w:instrText>
+    </w:r>
+    <w:r>
+      <w:rPr>
+        <w:rFonts w:ascii="맑은 고딕" w:hAnsi="맑은 고딕"/>
+        <w:b w:val="0"/>
+        <w:color w:val="787878"/>
+        <w:sz w:val="16"/>
+        <w:rFonts w:eastAsia="맑은 고딕"/>
+      </w:rPr>
+      <w:fldChar w:fldCharType="end"/>
+    </w:r>
+  </w:p>
+</w:ftr>
+</file>
+
+<file path=word/footer2.xml><?xml version="1.0" encoding="utf-8"?>
+<w:ftr xmlns:m="http://schemas.openxmlformats.org/officeDocument/2006/math" xmlns:mc="http://schemas.openxmlformats.org/markup-compatibility/2006" xmlns:mo="http://schemas.microsoft.com/office/mac/office/2008/main" xmlns:mv="urn:schemas-microsoft-com:mac:vml" xmlns:o="urn:schemas-microsoft-com:office:office" xmlns:r="http://schemas.openxmlformats.org/officeDocument/2006/relationships" xmlns:v="urn:schemas-microsoft-com:vml" xmlns:w10="urn:schemas-microsoft-com:office:word" xmlns:w14="http://schemas.microsoft.com/office/word/2010/wordml" xmlns:w="http://schemas.openxmlformats.org/wordprocessingml/2006/main" xmlns:wne="http://schemas.microsoft.com/office/word/2006/wordml" xmlns:wp14="http://schemas.microsoft.com/office/word/2010/wordprocessingDrawing" xmlns:wp="http://schemas.openxmlformats.org/drawingml/2006/wordprocessingDrawing" xmlns:wpc="http://schemas.microsoft.com/office/word/2010/wordprocessingCanvas" xmlns:wpg="http://schemas.microsoft.com/office/word/2010/wordprocessingGroup" xmlns:wpi="http://schemas.microsoft.com/office/word/2010/wordprocessingInk" xmlns:wps="http://schemas.microsoft.com/office/word/2010/wordprocessingShape" mc:Ignorable="w14 wp14">
+  <w:p>
+    <w:pPr>
+      <w:pStyle w:val="Footer"/>
+    </w:pPr>
+  </w:p>
+</w:ftr>
+</file>
+
+<file path=word/footer3.xml><?xml version="1.0" encoding="utf-8"?>
+<w:ftr xmlns:m="http://schemas.openxmlformats.org/officeDocument/2006/math" xmlns:mc="http://schemas.openxmlformats.org/markup-compatibility/2006" xmlns:mo="http://schemas.microsoft.com/office/mac/office/2008/main" xmlns:mv="urn:schemas-microsoft-com:mac:vml" xmlns:o="urn:schemas-microsoft-com:office:office" xmlns:r="http://schemas.openxmlformats.org/officeDocument/2006/relationships" xmlns:v="urn:schemas-microsoft-com:vml" xmlns:w10="urn:schemas-microsoft-com:office:word" xmlns:w14="http://schemas.microsoft.com/office/word/2010/wordml" xmlns:w="http://schemas.openxmlformats.org/wordprocessingml/2006/main" xmlns:wne="http://schemas.microsoft.com/office/word/2006/wordml" xmlns:wp14="http://schemas.microsoft.com/office/word/2010/wordprocessingDrawing" xmlns:wp="http://schemas.openxmlformats.org/drawingml/2006/wordprocessingDrawing" xmlns:wpc="http://schemas.microsoft.com/office/word/2010/wordprocessingCanvas" xmlns:wpg="http://schemas.microsoft.com/office/word/2010/wordprocessingGroup" xmlns:wpi="http://schemas.microsoft.com/office/word/2010/wordprocessingInk" xmlns:wps="http://schemas.microsoft.com/office/word/2010/wordprocessingShape" mc:Ignorable="w14 wp14">
+  <w:p>
+    <w:pPr>
+      <w:pStyle w:val="Footer"/>
+    </w:pPr>
+  </w:p>
+</w:ftr>
+</file>
+
+<file path=word/footer4.xml><?xml version="1.0" encoding="utf-8"?>
+<w:ftr xmlns:m="http://schemas.openxmlformats.org/officeDocument/2006/math" xmlns:mc="http://schemas.openxmlformats.org/markup-compatibility/2006" xmlns:mo="http://schemas.microsoft.com/office/mac/office/2008/main" xmlns:mv="urn:schemas-microsoft-com:mac:vml" xmlns:o="urn:schemas-microsoft-com:office:office" xmlns:r="http://schemas.openxmlformats.org/officeDocument/2006/relationships" xmlns:v="urn:schemas-microsoft-com:vml" xmlns:w10="urn:schemas-microsoft-com:office:word" xmlns:w14="http://schemas.microsoft.com/office/word/2010/wordml" xmlns:w="http://schemas.openxmlformats.org/wordprocessingml/2006/main" xmlns:wne="http://schemas.microsoft.com/office/word/2006/wordml" xmlns:wp14="http://schemas.microsoft.com/office/word/2010/wordprocessingDrawing" xmlns:wp="http://schemas.openxmlformats.org/drawingml/2006/wordprocessingDrawing" xmlns:wpc="http://schemas.microsoft.com/office/word/2010/wordprocessingCanvas" xmlns:wpg="http://schemas.microsoft.com/office/word/2010/wordprocessingGroup" xmlns:wpi="http://schemas.microsoft.com/office/word/2010/wordprocessingInk" xmlns:wps="http://schemas.microsoft.com/office/word/2010/wordprocessingShape" mc:Ignorable="w14 wp14">
+  <w:p>
+    <w:pPr>
+      <w:pStyle w:val="Footer"/>
+      <w:jc w:val="center"/>
+    </w:pPr>
+    <w:r>
+      <w:rPr>
+        <w:rFonts w:ascii="맑은 고딕" w:hAnsi="맑은 고딕"/>
+        <w:b w:val="0"/>
+        <w:color w:val="787878"/>
+        <w:sz w:val="16"/>
+        <w:rFonts w:eastAsia="맑은 고딕"/>
+      </w:rPr>
+      <w:t xml:space="preserve">본로이  |  기밀문서, 무단 배포 금지     </w:t>
+    </w:r>
+    <w:r>
+      <w:rPr>
+        <w:rFonts w:ascii="맑은 고딕" w:hAnsi="맑은 고딕"/>
+        <w:b w:val="0"/>
+        <w:color w:val="787878"/>
+        <w:sz w:val="16"/>
+        <w:rFonts w:eastAsia="맑은 고딕"/>
+      </w:rPr>
+      <w:fldChar w:fldCharType="begin"/>
+    </w:r>
+    <w:r>
+      <w:rPr>
+        <w:rFonts w:ascii="맑은 고딕" w:hAnsi="맑은 고딕"/>
+        <w:b w:val="0"/>
+        <w:color w:val="787878"/>
+        <w:sz w:val="16"/>
+        <w:rFonts w:eastAsia="맑은 고딕"/>
+      </w:rPr>
+      <w:instrText xml:space="preserve"> PAGE </w:instrText>
+    </w:r>
+    <w:r>
+      <w:rPr>
+        <w:rFonts w:ascii="맑은 고딕" w:hAnsi="맑은 고딕"/>
+        <w:b w:val="0"/>
+        <w:color w:val="787878"/>
+        <w:sz w:val="16"/>
+        <w:rFonts w:eastAsia="맑은 고딕"/>
+      </w:rPr>
+      <w:fldChar w:fldCharType="end"/>
+    </w:r>
+    <w:r>
+      <w:rPr>
+        <w:rFonts w:ascii="맑은 고딕" w:hAnsi="맑은 고딕"/>
+        <w:b w:val="0"/>
+        <w:color w:val="787878"/>
+        <w:sz w:val="16"/>
+        <w:rFonts w:eastAsia="맑은 고딕"/>
+      </w:rPr>
+      <w:t xml:space="preserve"> / </w:t>
+    </w:r>
+    <w:r>
+      <w:rPr>
+        <w:rFonts w:ascii="맑은 고딕" w:hAnsi="맑은 고딕"/>
+        <w:b w:val="0"/>
+        <w:color w:val="787878"/>
+        <w:sz w:val="16"/>
+        <w:rFonts w:eastAsia="맑은 고딕"/>
+      </w:rPr>
+      <w:fldChar w:fldCharType="begin"/>
+    </w:r>
+    <w:r>
+      <w:rPr>
+        <w:rFonts w:ascii="맑은 고딕" w:hAnsi="맑은 고딕"/>
+        <w:b w:val="0"/>
+        <w:color w:val="787878"/>
+        <w:sz w:val="16"/>
+        <w:rFonts w:eastAsia="맑은 고딕"/>
+      </w:rPr>
+      <w:instrText xml:space="preserve"> NUMPAGES </w:instrText>
+    </w:r>
+    <w:r>
+      <w:rPr>
+        <w:rFonts w:ascii="맑은 고딕" w:hAnsi="맑은 고딕"/>
+        <w:b w:val="0"/>
+        <w:color w:val="787878"/>
+        <w:sz w:val="16"/>
+        <w:rFonts w:eastAsia="맑은 고딕"/>
+      </w:rPr>
+      <w:fldChar w:fldCharType="end"/>
+    </w:r>
+  </w:p>
+</w:ftr>
+</file>
+
+<file path=word/footer5.xml><?xml version="1.0" encoding="utf-8"?>
+<w:ftr xmlns:m="http://schemas.openxmlformats.org/officeDocument/2006/math" xmlns:mc="http://schemas.openxmlformats.org/markup-compatibility/2006" xmlns:mo="http://schemas.microsoft.com/office/mac/office/2008/main" xmlns:mv="urn:schemas-microsoft-com:mac:vml" xmlns:o="urn:schemas-microsoft-com:office:office" xmlns:r="http://schemas.openxmlformats.org/officeDocument/2006/relationships" xmlns:v="urn:schemas-microsoft-com:vml" xmlns:w10="urn:schemas-microsoft-com:office:word" xmlns:w14="http://schemas.microsoft.com/office/word/2010/wordml" xmlns:w="http://schemas.openxmlformats.org/wordprocessingml/2006/main" xmlns:wne="http://schemas.microsoft.com/office/word/2006/wordml" xmlns:wp14="http://schemas.microsoft.com/office/word/2010/wordprocessingDrawing" xmlns:wp="http://schemas.openxmlformats.org/drawingml/2006/wordprocessingDrawing" xmlns:wpc="http://schemas.microsoft.com/office/word/2010/wordprocessingCanvas" xmlns:wpg="http://schemas.microsoft.com/office/word/2010/wordprocessingGroup" xmlns:wpi="http://schemas.microsoft.com/office/word/2010/wordprocessingInk" xmlns:wps="http://schemas.microsoft.com/office/word/2010/wordprocessingShape" mc:Ignorable="w14 wp14">
+  <w:p>
+    <w:pPr>
+      <w:pStyle w:val="Footer"/>
+      <w:jc w:val="center"/>
+    </w:pPr>
+    <w:r>
+      <w:rPr>
+        <w:rFonts w:ascii="맑은 고딕" w:hAnsi="맑은 고딕"/>
+        <w:b w:val="0"/>
+        <w:color w:val="787878"/>
+        <w:sz w:val="16"/>
+        <w:rFonts w:eastAsia="맑은 고딕"/>
+      </w:rPr>
+      <w:t xml:space="preserve">본로이  |  기밀문서, 무단 배포 금지     </w:t>
+    </w:r>
+    <w:r>
+      <w:rPr>
+        <w:rFonts w:ascii="맑은 고딕" w:hAnsi="맑은 고딕"/>
+        <w:b w:val="0"/>
+        <w:color w:val="787878"/>
+        <w:sz w:val="16"/>
+        <w:rFonts w:eastAsia="맑은 고딕"/>
+      </w:rPr>
+      <w:fldChar w:fldCharType="begin"/>
+    </w:r>
+    <w:r>
+      <w:rPr>
+        <w:rFonts w:ascii="맑은 고딕" w:hAnsi="맑은 고딕"/>
+        <w:b w:val="0"/>
+        <w:color w:val="787878"/>
+        <w:sz w:val="16"/>
+        <w:rFonts w:eastAsia="맑은 고딕"/>
+      </w:rPr>
+      <w:instrText xml:space="preserve"> PAGE </w:instrText>
+    </w:r>
+    <w:r>
+      <w:rPr>
+        <w:rFonts w:ascii="맑은 고딕" w:hAnsi="맑은 고딕"/>
+        <w:b w:val="0"/>
+        <w:color w:val="787878"/>
+        <w:sz w:val="16"/>
+        <w:rFonts w:eastAsia="맑은 고딕"/>
+      </w:rPr>
+      <w:fldChar w:fldCharType="end"/>
+    </w:r>
+    <w:r>
+      <w:rPr>
+        <w:rFonts w:ascii="맑은 고딕" w:hAnsi="맑은 고딕"/>
+        <w:b w:val="0"/>
+        <w:color w:val="787878"/>
+        <w:sz w:val="16"/>
+        <w:rFonts w:eastAsia="맑은 고딕"/>
+      </w:rPr>
+      <w:t xml:space="preserve"> / </w:t>
+    </w:r>
+    <w:r>
+      <w:rPr>
+        <w:rFonts w:ascii="맑은 고딕" w:hAnsi="맑은 고딕"/>
+        <w:b w:val="0"/>
+        <w:color w:val="787878"/>
+        <w:sz w:val="16"/>
+        <w:rFonts w:eastAsia="맑은 고딕"/>
+      </w:rPr>
+      <w:fldChar w:fldCharType="begin"/>
+    </w:r>
+    <w:r>
+      <w:rPr>
+        <w:rFonts w:ascii="맑은 고딕" w:hAnsi="맑은 고딕"/>
+        <w:b w:val="0"/>
+        <w:color w:val="787878"/>
+        <w:sz w:val="16"/>
+        <w:rFonts w:eastAsia="맑은 고딕"/>
+      </w:rPr>
+      <w:instrText xml:space="preserve"> NUMPAGES </w:instrText>
+    </w:r>
+    <w:r>
+      <w:rPr>
+        <w:rFonts w:ascii="맑은 고딕" w:hAnsi="맑은 고딕"/>
+        <w:b w:val="0"/>
+        <w:color w:val="787878"/>
+        <w:sz w:val="16"/>
+        <w:rFonts w:eastAsia="맑은 고딕"/>
+      </w:rPr>
+      <w:fldChar w:fldCharType="end"/>
+    </w:r>
+  </w:p>
+</w:ftr>
+</file>
+
+<file path=word/header1.xml><?xml version="1.0" encoding="utf-8"?>
+<w:hdr xmlns:m="http://schemas.openxmlformats.org/officeDocument/2006/math" xmlns:mc="http://schemas.openxmlformats.org/markup-compatibility/2006" xmlns:mo="http://schemas.microsoft.com/office/mac/office/2008/main" xmlns:mv="urn:schemas-microsoft-com:mac:vml" xmlns:o="urn:schemas-microsoft-com:office:office" xmlns:r="http://schemas.openxmlformats.org/officeDocument/2006/relationships" xmlns:v="urn:schemas-microsoft-com:vml" xmlns:w10="urn:schemas-microsoft-com:office:word" xmlns:w14="http://schemas.microsoft.com/office/word/2010/wordml" xmlns:w="http://schemas.openxmlformats.org/wordprocessingml/2006/main" xmlns:wne="http://schemas.microsoft.com/office/word/2006/wordml" xmlns:wp14="http://schemas.microsoft.com/office/word/2010/wordprocessingDrawing" xmlns:wp="http://schemas.openxmlformats.org/drawingml/2006/wordprocessingDrawing" xmlns:wpc="http://schemas.microsoft.com/office/word/2010/wordprocessingCanvas" xmlns:wpg="http://schemas.microsoft.com/office/word/2010/wordprocessingGroup" xmlns:wpi="http://schemas.microsoft.com/office/word/2010/wordprocessingInk" xmlns:wps="http://schemas.microsoft.com/office/word/2010/wordprocessingShape" mc:Ignorable="w14 wp14">
+  <w:p>
+    <w:pPr>
+      <w:pStyle w:val="Header"/>
+    </w:pPr>
+  </w:p>
+</w:hdr>
+</file>
+
+<file path=word/header2.xml><?xml version="1.0" encoding="utf-8"?>
+<w:hdr xmlns:m="http://schemas.openxmlformats.org/officeDocument/2006/math" xmlns:mc="http://schemas.openxmlformats.org/markup-compatibility/2006" xmlns:mo="http://schemas.microsoft.com/office/mac/office/2008/main" xmlns:mv="urn:schemas-microsoft-com:mac:vml" xmlns:o="urn:schemas-microsoft-com:office:office" xmlns:r="http://schemas.openxmlformats.org/officeDocument/2006/relationships" xmlns:v="urn:schemas-microsoft-com:vml" xmlns:w10="urn:schemas-microsoft-com:office:word" xmlns:w14="http://schemas.microsoft.com/office/word/2010/wordml" xmlns:w="http://schemas.openxmlformats.org/wordprocessingml/2006/main" xmlns:wne="http://schemas.microsoft.com/office/word/2006/wordml" xmlns:wp14="http://schemas.microsoft.com/office/word/2010/wordprocessingDrawing" xmlns:wp="http://schemas.openxmlformats.org/drawingml/2006/wordprocessingDrawing" xmlns:wpc="http://schemas.microsoft.com/office/word/2010/wordprocessingCanvas" xmlns:wpg="http://schemas.microsoft.com/office/word/2010/wordprocessingGroup" xmlns:wpi="http://schemas.microsoft.com/office/word/2010/wordprocessingInk" xmlns:wps="http://schemas.microsoft.com/office/word/2010/wordprocessingShape" mc:Ignorable="w14 wp14">
+  <w:p>
+    <w:pPr>
+      <w:pStyle w:val="Header"/>
+    </w:pPr>
+  </w:p>
+</w:hdr>
+</file>
+
+<file path=word/header3.xml><?xml version="1.0" encoding="utf-8"?>
+<w:hdr xmlns:m="http://schemas.openxmlformats.org/officeDocument/2006/math" xmlns:mc="http://schemas.openxmlformats.org/markup-compatibility/2006" xmlns:mo="http://schemas.microsoft.com/office/mac/office/2008/main" xmlns:mv="urn:schemas-microsoft-com:mac:vml" xmlns:o="urn:schemas-microsoft-com:office:office" xmlns:r="http://schemas.openxmlformats.org/officeDocument/2006/relationships" xmlns:v="urn:schemas-microsoft-com:vml" xmlns:w10="urn:schemas-microsoft-com:office:word" xmlns:w14="http://schemas.microsoft.com/office/word/2010/wordml" xmlns:w="http://schemas.openxmlformats.org/wordprocessingml/2006/main" xmlns:wne="http://schemas.microsoft.com/office/word/2006/wordml" xmlns:wp14="http://schemas.microsoft.com/office/word/2010/wordprocessingDrawing" xmlns:wp="http://schemas.openxmlformats.org/drawingml/2006/wordprocessingDrawing" xmlns:wpc="http://schemas.microsoft.com/office/word/2010/wordprocessingCanvas" xmlns:wpg="http://schemas.microsoft.com/office/word/2010/wordprocessingGroup" xmlns:wpi="http://schemas.microsoft.com/office/word/2010/wordprocessingInk" xmlns:wps="http://schemas.microsoft.com/office/word/2010/wordprocessingShape" mc:Ignorable="w14 wp14">
+  <w:p>
+    <w:pPr>
+      <w:pStyle w:val="Header"/>
+    </w:pPr>
+  </w:p>
+</w:hdr>
 </file>
 
 <file path=word/numbering.xml><?xml version="1.0" encoding="utf-8"?>

</xml_diff>

<commit_message>
chore: 작업 자동 저장 (2026-08-20 17:57)
</commit_message>
<xml_diff>
--- a/docs/government-project/01-1_화면설계서.docx
+++ b/docs/government-project/01-1_화면설계서.docx
@@ -452,7 +452,7 @@
                 <w:sz w:val="18"/>
                 <w:rFonts w:eastAsia="맑은 고딕"/>
               </w:rPr>
-              <w:t>설계는 확정됐으나 아직 화면에 붙지 않은 요소 — 숨기지 않고 그대로 표기한다</w:t>
+              <w:t>설계는 확정됐으나 아직 화면에 붙지 않은 요소: 숨기지 않고 그대로 표기한다</w:t>
             </w:r>
           </w:p>
         </w:tc>
@@ -642,7 +642,7 @@
                 <w:sz w:val="18"/>
                 <w:rFonts w:eastAsia="맑은 고딕"/>
               </w:rPr>
-              <w:t>홈 — 다국어 진입</w:t>
+              <w:t>홈: 다국어 진입</w:t>
             </w:r>
           </w:p>
         </w:tc>
@@ -729,7 +729,7 @@
                 <w:sz w:val="18"/>
                 <w:rFonts w:eastAsia="맑은 고딕"/>
               </w:rPr>
-              <w:t>문의 — 연락 방법 고르기 → 신청서</w:t>
+              <w:t>문의: 연락 방법 고르기 → 신청서</w:t>
             </w:r>
           </w:p>
         </w:tc>
@@ -990,7 +990,7 @@
                 <w:sz w:val="18"/>
                 <w:rFonts w:eastAsia="맑은 고딕"/>
               </w:rPr>
-              <w:t>소견 확인 — 환자용</w:t>
+              <w:t>소견 확인: 환자용</w:t>
             </w:r>
           </w:p>
         </w:tc>
@@ -1164,7 +1164,7 @@
                 <w:sz w:val="18"/>
                 <w:rFonts w:eastAsia="맑은 고딕"/>
               </w:rPr>
-              <w:t>케이스 상세 — 문의 하나를 끝까지</w:t>
+              <w:t>케이스 상세: 문의 하나를 끝까지</w:t>
             </w:r>
           </w:p>
         </w:tc>
@@ -1251,7 +1251,7 @@
                 <w:sz w:val="18"/>
                 <w:rFonts w:eastAsia="맑은 고딕"/>
               </w:rPr>
-              <w:t>사후관리 — 환자 화면(내 진료 관리)</w:t>
+              <w:t>사후관리: 환자 화면(내 진료 관리)</w:t>
             </w:r>
           </w:p>
         </w:tc>
@@ -1597,7 +1597,7 @@
           <w:sz w:val="24"/>
           <w:rFonts w:eastAsia="맑은 고딕"/>
         </w:rPr>
-        <w:t>P-01. 홈 — 다국어 진입</w:t>
+        <w:t>P-01. 홈: 다국어 진입</w:t>
       </w:r>
     </w:p>
     <w:tbl>
@@ -1855,7 +1855,7 @@
           <w:sz w:val="18"/>
           <w:rFonts w:eastAsia="맑은 고딕"/>
         </w:rPr>
-        <w:t>· 상단 바 — 로고 + [≡] 메뉴 (언어 전환·로그인은 메뉴 안에 있다)</w:t>
+        <w:t>· 상단 바: 로고 + [≡] 메뉴 (언어 전환·로그인은 메뉴 안에 있다)</w:t>
       </w:r>
     </w:p>
     <w:p>
@@ -1869,7 +1869,7 @@
           <w:sz w:val="18"/>
           <w:rFonts w:eastAsia="맑은 고딕"/>
         </w:rPr>
-        <w:t>· 히어로 — 큰 제목 「한국 최고 종양 전문의의 제2의견」 + 부제 3줄 + 단추 [무료 상담] 하나</w:t>
+        <w:t>· 히어로: 큰 제목 「한국 최고 종양 전문의의 제2의견」 + 부제 3줄 + 단추 [무료 상담] 하나</w:t>
       </w:r>
     </w:p>
     <w:p>
@@ -1883,7 +1883,7 @@
           <w:sz w:val="18"/>
           <w:rFonts w:eastAsia="맑은 고딕"/>
         </w:rPr>
-        <w:t>· 본문 큰 덩어리 10개 — 왜 한국인가 / 우리 의료팀 / healwith 가 하는 일 / 어떻게 진행되나 / 주요 암종 / 파트너 병원 / 진단부터 회복까지 동행 / 자주 묻는 질문 / 긴급 도움 / 오늘 시작하기</w:t>
+        <w:t>· 본문 큰 덩어리 10개: 왜 한국인가 / 우리 의료팀 / healwith 가 하는 일 / 어떻게 진행되나 / 주요 암종 / 파트너 병원 / 진단부터 회복까지 동행 / 자주 묻는 질문 / 긴급 도움 / 오늘 시작하기</w:t>
       </w:r>
     </w:p>
     <w:p>
@@ -1897,7 +1897,7 @@
           <w:sz w:val="18"/>
           <w:rFonts w:eastAsia="맑은 고딕"/>
         </w:rPr>
-        <w:t>· 우하단 — 떠 있는 대화 단추(「도움말」 말풍선) = AI 상담 진입점</w:t>
+        <w:t>· 우하단: 떠 있는 대화 단추(「도움말」 말풍선) = AI 상담 진입점</w:t>
       </w:r>
     </w:p>
     <w:p>
@@ -1911,7 +1911,7 @@
           <w:sz w:val="18"/>
           <w:rFonts w:eastAsia="맑은 고딕"/>
         </w:rPr>
-        <w:t>· 맨아래 — 유치업 등록번호 · 보증보험 · 법정 고지 · 개인정보 처리방침</w:t>
+        <w:t>· 맨아래: 유치업 등록번호 · 보증보험 · 법정 고지 · 개인정보 처리방침</w:t>
       </w:r>
     </w:p>
     <w:p>
@@ -1950,7 +1950,7 @@
           <w:sz w:val="18"/>
           <w:rFonts w:eastAsia="맑은 고딕"/>
         </w:rPr>
-        <w:t>· 다국어 사전 — 언어당 1,753키, 러시아어·카자흐어 각 100% (자동 검사 통과)</w:t>
+        <w:t>· 다국어 사전: 언어당 1,753키, 러시아어·카자흐어 각 100% (자동 검사 통과)</w:t>
       </w:r>
     </w:p>
     <w:p>
@@ -1964,7 +1964,7 @@
           <w:sz w:val="18"/>
           <w:rFonts w:eastAsia="맑은 고딕"/>
         </w:rPr>
-        <w:t>· hospitals — 8건 발행(협진 대학병원 4 + 면력한방병원 4지점). 그 외 이름·주소가 비어 미발행 상태인 빈 행 1건이 남아 있다</w:t>
+        <w:t>· hospitals: 8건 발행(협진 대학병원 4 + 면력한방병원 4지점). 그 외 이름·주소가 비어 미발행 상태인 빈 행 1건이 남아 있다</w:t>
       </w:r>
     </w:p>
     <w:p>
@@ -1978,7 +1978,7 @@
           <w:sz w:val="18"/>
           <w:rFonts w:eastAsia="맑은 고딕"/>
         </w:rPr>
-        <w:t>· site_settings — 노출 문구·배너(관리자 화면에서 수정)</w:t>
+        <w:t>· site_settings: 노출 문구·배너(관리자 화면에서 수정)</w:t>
       </w:r>
     </w:p>
     <w:p>
@@ -2061,7 +2061,7 @@
           <w:sz w:val="24"/>
           <w:rFonts w:eastAsia="맑은 고딕"/>
         </w:rPr>
-        <w:t>P-02. 문의 — 연락 방법 고르기 → 신청서</w:t>
+        <w:t>P-02. 문의: 연락 방법 고르기 → 신청서</w:t>
       </w:r>
     </w:p>
     <w:tbl>
@@ -2319,7 +2319,7 @@
           <w:sz w:val="18"/>
           <w:rFonts w:eastAsia="맑은 고딕"/>
         </w:rPr>
-        <w:t>· 갈림길 — ① AI 상담원(러시아어 24시간) / ② 실시간 상담원(메신저) / ③ 신청서 작성</w:t>
+        <w:t>· 갈림길: ① AI 상담원(러시아어 24시간) / ② 실시간 상담원(메신저) / ③ 신청서 작성</w:t>
       </w:r>
     </w:p>
     <w:p>
@@ -2333,7 +2333,7 @@
           <w:sz w:val="18"/>
           <w:rFonts w:eastAsia="맑은 고딕"/>
         </w:rPr>
-        <w:t>· 신뢰 표시 — 무료 상담 · 병원에 직접 결제(수수료 없음) · AES-256 암호화 · 1영업일 내 회신 · KHIDI 지원사업 · 등록 유치업자</w:t>
+        <w:t>· 신뢰 표시: 무료 상담 · 병원에 직접 결제(수수료 없음) · AES-256 암호화 · 1영업일 내 회신 · KHIDI 지원사업 · 등록 유치업자</w:t>
       </w:r>
     </w:p>
     <w:p>
@@ -2347,7 +2347,7 @@
           <w:sz w:val="18"/>
           <w:rFonts w:eastAsia="맑은 고딕"/>
         </w:rPr>
-        <w:t>· ③을 고르면 1단계 접수 — 이름 · 연락 수단 · 국적 · 선호 언어 / 암종 · 병기 / 하고 싶은 말</w:t>
+        <w:t>· ③을 고르면 1단계 접수: 이름 · 연락 수단 · 국적 · 선호 언어 / 암종 · 병기 / 하고 싶은 말</w:t>
       </w:r>
     </w:p>
     <w:p>
@@ -2361,7 +2361,7 @@
           <w:sz w:val="18"/>
           <w:rFonts w:eastAsia="맑은 고딕"/>
         </w:rPr>
-        <w:t>· 동의 4종(필수) — 개인정보 수집 · 민감정보(건강) · 제3자 제공(병원) · 국외이전</w:t>
+        <w:t>· 동의 4종(필수): 개인정보 수집 · 민감정보(건강) · 제3자 제공(병원) · 국외이전</w:t>
       </w:r>
     </w:p>
     <w:p>
@@ -2375,7 +2375,7 @@
           <w:sz w:val="18"/>
           <w:rFonts w:eastAsia="맑은 고딕"/>
         </w:rPr>
-        <w:t>· 접수 뒤 2단계 — 별도 주소 /inquiry/intake (문의번호·열쇠 필요). 첨부 최대 10개, 건당 200MB</w:t>
+        <w:t>· 접수 뒤 2단계: 별도 주소 /inquiry/intake (문의번호·열쇠 필요). 첨부 최대 10개, 건당 200MB</w:t>
       </w:r>
     </w:p>
     <w:p>
@@ -2400,7 +2400,7 @@
           <w:sz w:val="18"/>
           <w:rFonts w:eastAsia="맑은 고딕"/>
         </w:rPr>
-        <w:t>· inquiries — 전체 144건 중 실환자 8건(시험 문의는 표식으로 분리)</w:t>
+        <w:t>· inquiries: 전체 144건 중 실환자 8건(시험 문의는 표식으로 분리)</w:t>
       </w:r>
     </w:p>
     <w:p>
@@ -2414,7 +2414,7 @@
           <w:sz w:val="18"/>
           <w:rFonts w:eastAsia="맑은 고딕"/>
         </w:rPr>
-        <w:t>· cancer_patient_intakes — 59건(암종·병기·치료 이력)</w:t>
+        <w:t>· cancer_patient_intakes: 59건(암종·병기·치료 이력)</w:t>
       </w:r>
     </w:p>
     <w:p>
@@ -2428,7 +2428,7 @@
           <w:sz w:val="18"/>
           <w:rFonts w:eastAsia="맑은 고딕"/>
         </w:rPr>
-        <w:t>· 첨부 — 브라우저에서 저장소로 직행 업로드(건당 최대 200MB)</w:t>
+        <w:t>· 첨부: 브라우저에서 저장소로 직행 업로드(건당 최대 200MB)</w:t>
       </w:r>
     </w:p>
     <w:p>
@@ -2494,7 +2494,7 @@
           <w:sz w:val="18"/>
           <w:rFonts w:eastAsia="맑은 고딕"/>
         </w:rPr>
-        <w:t>※ 2단계는 접수 후에만 들어간다 — 문의번호·열쇠 없이 열면 「Missing inquiryId or token」.</w:t>
+        <w:t>※ 2단계는 접수 후에만 들어간다. 문의번호·열쇠 없이 열면 「Missing inquiryId or token」.</w:t>
       </w:r>
     </w:p>
     <w:p>
@@ -2509,7 +2509,7 @@
           <w:sz w:val="18"/>
           <w:rFonts w:eastAsia="맑은 고딕"/>
         </w:rPr>
-        <w:t>※ 1단계만 채워도 접수된다 — 자료가 없어 못 보내는 일을 없앤다.</w:t>
+        <w:t>※ 1단계만 채워도 접수된다. 자료가 없어 못 보내는 일을 없앤다.</w:t>
       </w:r>
     </w:p>
     <w:p>
@@ -2799,7 +2799,7 @@
           <w:sz w:val="18"/>
           <w:rFonts w:eastAsia="맑은 고딕"/>
         </w:rPr>
-        <w:t>· 대화 영역 — 환자/AI 말풍선</w:t>
+        <w:t>· 대화 영역: 환자/AI 말풍선</w:t>
       </w:r>
     </w:p>
     <w:p>
@@ -2813,7 +2813,7 @@
           <w:sz w:val="18"/>
           <w:rFonts w:eastAsia="맑은 고딕"/>
         </w:rPr>
-        <w:t>· 근거 패널 — DB에서 찾은 문서 3~5건(병원명·시술·출처)</w:t>
+        <w:t>· 근거 패널: DB에서 찾은 문서 3~5건(병원명·시술·출처)</w:t>
       </w:r>
     </w:p>
     <w:p>
@@ -2827,7 +2827,7 @@
           <w:sz w:val="18"/>
           <w:rFonts w:eastAsia="맑은 고딕"/>
         </w:rPr>
-        <w:t>· 안전장치 — DB에 없는 병원은 추천 불가, 연락처 없이 「접수됨」이라 말하지 않음</w:t>
+        <w:t>· 안전장치: DB에 없는 병원은 추천 불가, 연락처 없이 「접수됨」이라 말하지 않음</w:t>
       </w:r>
     </w:p>
     <w:p>
@@ -2841,7 +2841,7 @@
           <w:sz w:val="18"/>
           <w:rFonts w:eastAsia="맑은 고딕"/>
         </w:rPr>
-        <w:t>· 입력창 — 6개 언어 자동 감지</w:t>
+        <w:t>· 입력창: 6개 언어 자동 감지</w:t>
       </w:r>
     </w:p>
     <w:p>
@@ -2880,7 +2880,7 @@
           <w:sz w:val="18"/>
           <w:rFonts w:eastAsia="맑은 고딕"/>
         </w:rPr>
-        <w:t>· rag_documents 21건(병원·진료 항목) — 검색 근거 원장</w:t>
+        <w:t>· rag_documents 21건(병원·진료 항목): 검색 근거 원장</w:t>
       </w:r>
     </w:p>
     <w:p>
@@ -2894,7 +2894,7 @@
           <w:sz w:val="18"/>
           <w:rFonts w:eastAsia="맑은 고딕"/>
         </w:rPr>
-        <w:t>· ai_response_evaluations · ai_regression_runs — 품질 자동 시험 기록</w:t>
+        <w:t>· ai_response_evaluations · ai_regression_runs: 품질 자동 시험 기록</w:t>
       </w:r>
     </w:p>
     <w:p>
@@ -2960,7 +2960,7 @@
           <w:sz w:val="18"/>
           <w:rFonts w:eastAsia="맑은 고딕"/>
         </w:rPr>
-        <w:t>※ 품질은 매일 자동 시험한다 — 의료 레드라인(완치 단정·지어낸 병원) 위반을 검출해 경보한다.</w:t>
+        <w:t>※ 품질은 매일 자동 시험한다. 의료 레드라인(완치 단정·지어낸 병원) 위반을 검출해 경보한다.</w:t>
       </w:r>
     </w:p>
     <w:p>
@@ -3235,7 +3235,7 @@
           <w:sz w:val="18"/>
           <w:rFonts w:eastAsia="맑은 고딕"/>
         </w:rPr>
-        <w:t>· 영상 영역 — 상대 화면(크게) / 내 화면(작게)</w:t>
+        <w:t>· 영상 영역: 상대 화면(크게) / 내 화면(작게)</w:t>
       </w:r>
     </w:p>
     <w:p>
@@ -3249,7 +3249,7 @@
           <w:sz w:val="18"/>
           <w:rFonts w:eastAsia="맑은 고딕"/>
         </w:rPr>
-        <w:t>· 참가자·대기실 — 입장 요청 승인·거절</w:t>
+        <w:t>· 참가자·대기실: 입장 요청 승인·거절</w:t>
       </w:r>
     </w:p>
     <w:p>
@@ -3263,7 +3263,7 @@
           <w:sz w:val="18"/>
           <w:rFonts w:eastAsia="맑은 고딕"/>
         </w:rPr>
-        <w:t>· 실시간 자막 — 상대 발화를 내 언어로(한 줄 스택, 가운데 정렬)</w:t>
+        <w:t>· 실시간 자막: 상대 발화를 내 언어로(한 줄 스택, 가운데 정렬)</w:t>
       </w:r>
     </w:p>
     <w:p>
@@ -3277,7 +3277,7 @@
           <w:sz w:val="18"/>
           <w:rFonts w:eastAsia="맑은 고딕"/>
         </w:rPr>
-        <w:t>· 자막 켜기·끄기 — 누를 때만 켜진다(자동 켜짐 없음)</w:t>
+        <w:t>· 자막 켜기·끄기: 누를 때만 켜진다(자동 켜짐 없음)</w:t>
       </w:r>
     </w:p>
     <w:p>
@@ -3291,7 +3291,7 @@
           <w:sz w:val="18"/>
           <w:rFonts w:eastAsia="맑은 고딕"/>
         </w:rPr>
-        <w:t>· 도구 막대 — 마이크·카메라·화면공유·잡음제거·[상담 완료]</w:t>
+        <w:t>· 도구 막대: 마이크·카메라·화면공유·잡음제거·[상담 완료]</w:t>
       </w:r>
     </w:p>
     <w:p>
@@ -3330,7 +3330,7 @@
           <w:sz w:val="18"/>
           <w:rFonts w:eastAsia="맑은 고딕"/>
         </w:rPr>
-        <w:t>· consultation_translations 3,542건 — 러→한 2,593 · 한→러 487 · 카자흐→한 117 등</w:t>
+        <w:t>· consultation_translations 3,542건: 러→한 2,593 · 한→러 487 · 카자흐→한 117 등</w:t>
       </w:r>
     </w:p>
     <w:p>
@@ -3395,7 +3395,7 @@
           <w:sz w:val="18"/>
           <w:rFonts w:eastAsia="맑은 고딕"/>
         </w:rPr>
-        <w:t>※ [상담 완료]를 눌러야 성과지표에 잡힌다 — 통화 종료만으로는 세지 않는다.</w:t>
+        <w:t>※ [상담 완료]를 눌러야 성과지표에 잡힌다. 통화 종료만으로는 세지 않는다.</w:t>
       </w:r>
     </w:p>
     <w:p>
@@ -3427,7 +3427,7 @@
           <w:sz w:val="24"/>
           <w:rFonts w:eastAsia="맑은 고딕"/>
         </w:rPr>
-        <w:t>P-05. 소견 확인 — 환자용</w:t>
+        <w:t>P-05. 소견 확인: 환자용</w:t>
       </w:r>
     </w:p>
     <w:tbl>
@@ -3685,7 +3685,7 @@
           <w:sz w:val="18"/>
           <w:rFonts w:eastAsia="맑은 고딕"/>
         </w:rPr>
-        <w:t>· 환자 안내 머리말 — 담당 의료진·작성일·소속 병원</w:t>
+        <w:t>· 환자 안내 머리말: 담당 의료진·작성일·소속 병원</w:t>
       </w:r>
     </w:p>
     <w:p>
@@ -3699,7 +3699,7 @@
           <w:sz w:val="18"/>
           <w:rFonts w:eastAsia="맑은 고딕"/>
         </w:rPr>
-        <w:t>· 소견 문서 미리보기 — 병원이 발급한 공식 문서 그대로</w:t>
+        <w:t>· 소견 문서 미리보기: 병원이 발급한 공식 문서 그대로</w:t>
       </w:r>
     </w:p>
     <w:p>
@@ -3713,7 +3713,7 @@
           <w:sz w:val="18"/>
           <w:rFonts w:eastAsia="맑은 고딕"/>
         </w:rPr>
-        <w:t>· 언어 — 환자 언어 자동 선택(문의서 언어 → 브라우저 → 영어)</w:t>
+        <w:t>· 언어: 환자 언어 자동 선택(문의서 언어 → 브라우저 → 영어)</w:t>
       </w:r>
     </w:p>
     <w:p>
@@ -3727,7 +3727,7 @@
           <w:sz w:val="18"/>
           <w:rFonts w:eastAsia="맑은 고딕"/>
         </w:rPr>
-        <w:t>· 첨부 — 검사지·영상 판독본</w:t>
+        <w:t>· 첨부: 검사지·영상 판독본</w:t>
       </w:r>
     </w:p>
     <w:p>
@@ -3741,7 +3741,7 @@
           <w:sz w:val="18"/>
           <w:rFonts w:eastAsia="맑은 고딕"/>
         </w:rPr>
-        <w:t>· 다음 단계 안내 — 추가 자료 요청·원격협진 예약·방한 일정 문의</w:t>
+        <w:t>· 다음 단계 안내: 추가 자료 요청·원격협진 예약·방한 일정 문의</w:t>
       </w:r>
     </w:p>
     <w:p>
@@ -3780,7 +3780,7 @@
           <w:sz w:val="18"/>
           <w:rFonts w:eastAsia="맑은 고딕"/>
         </w:rPr>
-        <w:t>· attachment_translations 12건 — 외국 검사지·진료기록을 AI가 읽어 표의 행·칸까지 구조화</w:t>
+        <w:t>· attachment_translations 12건: 외국 검사지·진료기록을 AI가 읽어 표의 행·칸까지 구조화</w:t>
       </w:r>
     </w:p>
     <w:p>
@@ -4106,7 +4106,7 @@
           <w:sz w:val="18"/>
           <w:rFonts w:eastAsia="맑은 고딕"/>
         </w:rPr>
-        <w:t>· 왼쪽 메뉴 16개 — 대시보드 · 문의함 · AI 상담 리드 · 의뢰·케이스/병원배정 · 상담 일정 · 유치 전환 · 사후관리·만족도 · 파트너 발굴 · 메시지 · 비자 트래킹 · 견적 · 증상 알림 · 콘텐츠 편집 · 개선 요청함 · 설정</w:t>
+        <w:t>· 왼쪽 메뉴 16개: 대시보드 · 문의함 · AI 상담 리드 · 의뢰·케이스/병원배정 · 상담 일정 · 유치 전환 · 사후관리·만족도 · 파트너 발굴 · 메시지 · 비자 트래킹 · 견적 · 증상 알림 · 콘텐츠 편집 · 개선 요청함 · 설정</w:t>
       </w:r>
     </w:p>
     <w:p>
@@ -4120,7 +4120,7 @@
           <w:sz w:val="18"/>
           <w:rFonts w:eastAsia="맑은 고딕"/>
         </w:rPr>
-        <w:t>· 거르기 세 갈래 — 전체 / 추가 정보 필요 / 매칭 준비 완료 (각 건수 표시)</w:t>
+        <w:t>· 거르기 세 갈래: 전체 / 추가 정보 필요 / 매칭 준비 완료 (각 건수 표시)</w:t>
       </w:r>
     </w:p>
     <w:p>
@@ -4134,7 +4134,7 @@
           <w:sz w:val="18"/>
           <w:rFonts w:eastAsia="맑은 고딕"/>
         </w:rPr>
-        <w:t>· 목록 표 — 이름 | 국적 | 암종 | 연락방법 | Step 완료(1만 / 1+2) | 접수일 | 상태</w:t>
+        <w:t>· 목록 표: 이름 | 국적 | 암종 | 연락방법 | Step 완료(1만 / 1+2) | 접수일 | 상태</w:t>
       </w:r>
     </w:p>
     <w:p>
@@ -4148,7 +4148,7 @@
           <w:sz w:val="18"/>
           <w:rFonts w:eastAsia="맑은 고딕"/>
         </w:rPr>
-        <w:t>· 상태 칸에 빨간 배지 「N일째 정체」 — 단계 기준일을 넘긴 케이스를 표시</w:t>
+        <w:t>· 상태 칸에 빨간 배지 「N일째 정체」: 단계 기준일을 넘긴 케이스를 표시</w:t>
       </w:r>
     </w:p>
     <w:p>
@@ -4173,7 +4173,7 @@
           <w:sz w:val="18"/>
           <w:rFonts w:eastAsia="맑은 고딕"/>
         </w:rPr>
-        <w:t>· inquiries — 목록에 실제로 뜬 건수 8건 = 실환자 8건(시험 문의는 자동으로 빠진다)</w:t>
+        <w:t>· inquiries: 목록에 실제로 뜬 건수 8건 = 실환자 8건(시험 문의는 자동으로 빠진다)</w:t>
       </w:r>
     </w:p>
     <w:p>
@@ -4255,7 +4255,7 @@
           <w:sz w:val="24"/>
           <w:rFonts w:eastAsia="맑은 고딕"/>
         </w:rPr>
-        <w:t>P-07. 케이스 상세 — 문의 하나를 끝까지</w:t>
+        <w:t>P-07. 케이스 상세: 문의 하나를 끝까지</w:t>
       </w:r>
     </w:p>
     <w:tbl>
@@ -4513,7 +4513,7 @@
           <w:sz w:val="18"/>
           <w:rFonts w:eastAsia="맑은 고딕"/>
         </w:rPr>
-        <w:t>· 머리말 — 환자 이름 · 회원/비회원 · 담당자 · 문의 번호 · 접수 시각 · Step 완료 · 상태</w:t>
+        <w:t>· 머리말: 환자 이름 · 회원/비회원 · 담당자 · 문의 번호 · 접수 시각 · Step 완료 · 상태</w:t>
       </w:r>
     </w:p>
     <w:p>
@@ -4527,7 +4527,7 @@
           <w:sz w:val="18"/>
           <w:rFonts w:eastAsia="맑은 고딕"/>
         </w:rPr>
-        <w:t>· 케이스 브리프(AI 초안) — 환자 요약 · 원하는 것 · 「코디가 볼 포인트」 · 「주의」 + 「진단이 아니며 검수 필요」 고지</w:t>
+        <w:t>· 케이스 브리프(AI 초안): 환자 요약 · 원하는 것 · 「코디가 볼 포인트」 · 「주의」 + 「진단이 아니며 검수 필요」 고지</w:t>
       </w:r>
     </w:p>
     <w:p>
@@ -4555,7 +4555,7 @@
           <w:sz w:val="18"/>
           <w:rFonts w:eastAsia="맑은 고딕"/>
         </w:rPr>
-        <w:t>· 동의 항목 5종 — 개인정보 · 민감정보(건강) · 국경 간 이전 · 제3자(병원) 제공 · 마케팅(선택) + 동의 시각(KST) · 동의서 판번호</w:t>
+        <w:t>· 동의 항목 5종: 개인정보 · 민감정보(건강) · 국경 간 이전 · 제3자(병원) 제공 · 마케팅(선택) + 동의 시각(KST) · 동의서 판번호</w:t>
       </w:r>
     </w:p>
     <w:p>
@@ -4569,7 +4569,7 @@
           <w:sz w:val="18"/>
           <w:rFonts w:eastAsia="맑은 고딕"/>
         </w:rPr>
-        <w:t>· 첨부 서류 + [전부 받기] · 파일마다 [한] [EN] [RU] 변환 — AI 문서 번역 진입점</w:t>
+        <w:t>· 첨부 서류 + [전부 받기] · 파일마다 [한] [EN] [RU] 변환: AI 문서 번역 진입점</w:t>
       </w:r>
     </w:p>
     <w:p>
@@ -4583,7 +4583,7 @@
           <w:sz w:val="18"/>
           <w:rFonts w:eastAsia="맑은 고딕"/>
         </w:rPr>
-        <w:t>· 환자 대신 서류 올리기 — PDF·이미지·Word 200MB / ZIP·RAR·DICOM 200MB</w:t>
+        <w:t>· 환자 대신 서류 올리기: PDF·이미지·Word 200MB / ZIP·RAR·DICOM 200MB</w:t>
       </w:r>
     </w:p>
     <w:p>
@@ -4597,7 +4597,7 @@
           <w:sz w:val="18"/>
           <w:rFonts w:eastAsia="맑은 고딕"/>
         </w:rPr>
-        <w:t>· 전문의 소견 — [소견 요청 링크 만들기] · [이미 받은 소견 직접 입력] → 도착 소견 목록 → 환자 언어 자동 번역 초안 → 코디 교정 후 [에이전시에 공개]</w:t>
+        <w:t>· 전문의 소견: [소견 요청 링크 만들기] · [이미 받은 소견 직접 입력] → 도착 소견 목록 → 환자 언어 자동 번역 초안 → 코디 교정 후 [에이전시에 공개]</w:t>
       </w:r>
     </w:p>
     <w:p>
@@ -4636,7 +4636,7 @@
           <w:sz w:val="18"/>
           <w:rFonts w:eastAsia="맑은 고딕"/>
         </w:rPr>
-        <w:t>· attachment_translations 12건 — 외국 검사지를 표의 행·칸까지 구조화(숫자·단위·정상범위는 원문 그대로)</w:t>
+        <w:t>· attachment_translations 12건: 외국 검사지를 표의 행·칸까지 구조화(숫자·단위·정상범위는 원문 그대로)</w:t>
       </w:r>
     </w:p>
     <w:p>
@@ -4702,7 +4702,7 @@
           <w:sz w:val="18"/>
           <w:rFonts w:eastAsia="맑은 고딕"/>
         </w:rPr>
-        <w:t>※ 번역은 요약이 아니라 1:1 옮김이다 — 한국 의료진이 원본과 대조할 수 있어야 한다.</w:t>
+        <w:t>※ 번역은 요약이 아니라 1:1 옮김이다. 한국 의료진이 원본과 대조할 수 있어야 한다.</w:t>
       </w:r>
     </w:p>
     <w:p>
@@ -4719,7 +4719,7 @@
           <w:sz w:val="24"/>
           <w:rFonts w:eastAsia="맑은 고딕"/>
         </w:rPr>
-        <w:t>P-08. 사후관리 — 환자 화면(내 진료 관리)</w:t>
+        <w:t>P-08. 사후관리: 환자 화면(내 진료 관리)</w:t>
       </w:r>
     </w:p>
     <w:tbl>
@@ -4991,7 +4991,7 @@
           <w:sz w:val="18"/>
           <w:rFonts w:eastAsia="맑은 고딕"/>
         </w:rPr>
-        <w:t>· 빠른 메뉴 6종 — ①내 상담 ②의료 문서(/patient/documents) ③암 치료 가이드(/education) ④증상 기록(/patient/symptoms) ⑤재진 예약(/patient/rebooking) ⑥비자 가이드(/visa)</w:t>
+        <w:t>· 빠른 메뉴 6종: ①내 상담 ②의료 문서(/patient/documents) ③암 치료 가이드(/education) ④증상 기록(/patient/symptoms) ⑤재진 예약(/patient/rebooking) ⑥비자 가이드(/visa)</w:t>
       </w:r>
     </w:p>
     <w:p>
@@ -5005,7 +5005,7 @@
           <w:sz w:val="18"/>
           <w:rFonts w:eastAsia="맑은 고딕"/>
         </w:rPr>
-        <w:t>· 내 문의 · 내 상담 목록 — 접수한 문의와 잡힌 상담이 이어서 표시</w:t>
+        <w:t>· 내 문의 · 내 상담 목록: 접수한 문의와 잡힌 상담이 이어서 표시</w:t>
       </w:r>
     </w:p>
     <w:p>
@@ -5033,7 +5033,7 @@
           <w:sz w:val="18"/>
           <w:rFonts w:eastAsia="맑은 고딕"/>
         </w:rPr>
-        <w:t>· 뒤에서 도는 것 — AI가 증상 기록을 읽어 위험도를 산출하고 담당자에게 알린다</w:t>
+        <w:t>· 뒤에서 도는 것. AI가 증상 기록을 읽어 위험도를 산출하고 담당자에게 알린다</w:t>
       </w:r>
     </w:p>
     <w:p>
@@ -5047,7 +5047,7 @@
           <w:sz w:val="18"/>
           <w:rFonts w:eastAsia="맑은 고딕"/>
         </w:rPr>
-        <w:t>· [남은 것] 단계별 교육 자동 발송 — 귀국 후 시기에 맞춰 보내는 부분만 화면에 안 붙었다</w:t>
+        <w:t>· [남은 것] 단계별 교육 자동 발송: 귀국 후 시기에 맞춰 보내는 부분만 화면에 안 붙었다</w:t>
       </w:r>
     </w:p>
     <w:p>
@@ -5072,7 +5072,7 @@
           <w:sz w:val="18"/>
           <w:rFonts w:eastAsia="맑은 고딕"/>
         </w:rPr>
-        <w:t>· education_contents 18건 — 위·유방·간·폐·갑상선 5종, 러시아어 본문 전건 채워 발행</w:t>
+        <w:t>· education_contents 18건: 위·유방·간·폐·갑상선 5종, 러시아어 본문 전건 채워 발행</w:t>
       </w:r>
     </w:p>
     <w:p>
@@ -5086,7 +5086,7 @@
           <w:sz w:val="18"/>
           <w:rFonts w:eastAsia="맑은 고딕"/>
         </w:rPr>
-        <w:t>· symptom_reports 1건 · followup_schedules 0건 — 기능은 서 있으나 유치 확정 환자가 없어 실사용이 없다</w:t>
+        <w:t>· symptom_reports 1건 · followup_schedules 0건: 기능은 서 있으나 유치 확정 환자가 없어 실사용이 없다</w:t>
       </w:r>
     </w:p>
     <w:p>
@@ -5166,7 +5166,7 @@
           <w:sz w:val="18"/>
           <w:rFonts w:eastAsia="맑은 고딕"/>
         </w:rPr>
-        <w:t>※ 교육 콘텐츠는 환자 전용 화면이 아니라 공개 화면 /education 을 그대로 쓴다 — 6개 언어로 실서비스 중.</w:t>
+        <w:t>※ 교육 콘텐츠는 환자 전용 화면이 아니라 공개 화면 /education 을 그대로 쓴다. 6개 언어로 실서비스 중.</w:t>
       </w:r>
     </w:p>
     <w:p>
@@ -5388,7 +5388,7 @@
                 <w:sz w:val="18"/>
                 <w:rFonts w:eastAsia="맑은 고딕"/>
               </w:rPr>
-              <w:t>성과지표를 사람이 세지 않고 화면이 세게 한다 — 보고서 숫자와 화면 숫자가 갈리지 않게.</w:t>
+              <w:t>성과지표를 사람이 세지 않고 화면이 세게 한다. 보고서 숫자와 화면 숫자가 갈리지 않게.</w:t>
             </w:r>
           </w:p>
         </w:tc>
@@ -5456,7 +5456,7 @@
           <w:sz w:val="18"/>
           <w:rFonts w:eastAsia="맑은 고딕"/>
         </w:rPr>
-        <w:t>· 기간 고르기 — 최근 30일 / 90일 / 1년 + 「실적만」 스위치(켜면 시험 데이터 제외)</w:t>
+        <w:t>· 기간 고르기: 최근 30일 / 90일 / 1년 + 「실적만」 스위치(켜면 시험 데이터 제외)</w:t>
       </w:r>
     </w:p>
     <w:p>
@@ -5470,7 +5470,7 @@
           <w:sz w:val="18"/>
           <w:rFonts w:eastAsia="맑은 고딕"/>
         </w:rPr>
-        <w:t>· 유치 깔때기 — 문의 접수 → 사전상담 완료 → 견적·비자 진행 → 유치 확정 → 사후관리 완료</w:t>
+        <w:t>· 유치 깔때기: 문의 접수 → 사전상담 완료 → 견적·비자 진행 → 유치 확정 → 사후관리 완료</w:t>
       </w:r>
     </w:p>
     <w:p>
@@ -5484,7 +5484,7 @@
           <w:sz w:val="18"/>
           <w:rFonts w:eastAsia="맑은 고딕"/>
         </w:rPr>
-        <w:t>· 전환율 카드 3종 — 문의→사전상담 · 사전상담→유치 · 전체 유치율</w:t>
+        <w:t>· 전환율 카드 3종: 문의→사전상담 · 사전상담→유치 · 전체 유치율</w:t>
       </w:r>
     </w:p>
     <w:p>
@@ -5512,7 +5512,7 @@
           <w:sz w:val="18"/>
           <w:rFonts w:eastAsia="맑은 고딕"/>
         </w:rPr>
-        <w:t>· 유치 확정 대기 — [유치 확정] [이탈] [테스트로 표시] 로 결과를 코디가 입력</w:t>
+        <w:t>· 유치 확정 대기: [유치 확정] [이탈] [테스트로 표시] 로 결과를 코디가 입력</w:t>
       </w:r>
     </w:p>
     <w:p>
@@ -5537,7 +5537,7 @@
           <w:sz w:val="18"/>
           <w:rFonts w:eastAsia="맑은 고딕"/>
         </w:rPr>
-        <w:t>· 2026-08-19 기준 — 문의 8 · 사전상담 완료 1(12.5%) · 유치 0 · 사후관리 0</w:t>
+        <w:t>· 2026-08-19 기준: 문의 8 · 사전상담 완료 1(12.5%) · 유치 0 · 사후관리 0</w:t>
       </w:r>
     </w:p>
     <w:p>
@@ -5616,7 +5616,7 @@
           <w:sz w:val="18"/>
           <w:rFonts w:eastAsia="맑은 고딕"/>
         </w:rPr>
-        <w:t>※ 깔때기의 사전상담(1)은 문의에 연결된 건, 기관별 표의 사전상담(3)은 전체 세션 — 세는 기준이 다르다.</w:t>
+        <w:t>※ 깔때기의 사전상담(1)은 문의에 연결된 건, 기관별 표의 사전상담(3)은 전체 세션: 세는 기준이 다르다.</w:t>
       </w:r>
     </w:p>
     <w:p>
@@ -6801,7 +6801,7 @@
                 <w:sz w:val="18"/>
                 <w:rFonts w:eastAsia="맑은 고딕"/>
               </w:rPr>
-              <w:t>예약 리마인더 — 의료진 일정 연동</w:t>
+              <w:t>예약 리마인더: 의료진 일정 연동</w:t>
             </w:r>
           </w:p>
         </w:tc>

</xml_diff>

<commit_message>
chore: 작업 자동 저장 (2026-08-20 18:21)
</commit_message>
<xml_diff>
--- a/docs/government-project/01-1_화면설계서.docx
+++ b/docs/government-project/01-1_화면설계서.docx
@@ -49,7 +49,7 @@
           <w:sz w:val="24"/>
           <w:rFonts w:eastAsia="맑은 고딕"/>
         </w:rPr>
-        <w:t>(lo-fi 와이어프레임 기반)</w:t>
+        <w:t>(저해상도 뼈대 그림 기반)</w:t>
       </w:r>
     </w:p>
     <w:p/>
@@ -243,7 +243,7 @@
                 <w:sz w:val="18"/>
                 <w:rFonts w:eastAsia="맑은 고딕"/>
               </w:rPr>
-              <w:t>2026. 8. 19.</w:t>
+              <w:t>2026. 8. 20.</w:t>
             </w:r>
           </w:p>
         </w:tc>
@@ -322,7 +322,7 @@
           <w:sz w:val="20"/>
           <w:rFonts w:eastAsia="맑은 고딕"/>
         </w:rPr>
-        <w:t>본 문서는 HEALO 플랫폼의 화면 구성과 화면 간 이동을 설계 수준에서 규정한다. 사업계획서 1단계 산출물로 명시된 「요구사항 정의서·화면 설계서」 중 화면 설계서에 해당하며, 요구사항 정의서(01)의 기능 요구를 화면 단위로 배치한 것이다.</w:t>
+        <w:t>본 문서는 HEALO 플랫폼의 화면 구성과 화면 사이 이동을 설계 수준에서 규정한다. 사업계획서 1단계 산출물로 명시된 「요구사항 정의서·화면 설계서」 중 화면 설계서에 해당하며, 요구사항 정의서(01)의 기능 요구를 화면 단위로 배치한 것이다.</w:t>
       </w:r>
     </w:p>
     <w:p>
@@ -416,7 +416,7 @@
                 <w:sz w:val="18"/>
                 <w:rFonts w:eastAsia="맑은 고딕"/>
               </w:rPr>
-              <w:t>실서비스에 서 있는 화면 요소</w:t>
+              <w:t>이미 만들어져 실서비스에서 돌아가는 화면 요소</w:t>
             </w:r>
           </w:p>
         </w:tc>
@@ -452,7 +452,7 @@
                 <w:sz w:val="18"/>
                 <w:rFonts w:eastAsia="맑은 고딕"/>
               </w:rPr>
-              <w:t>설계는 확정됐으나 아직 화면에 붙지 않은 요소: 숨기지 않고 그대로 표기한다</w:t>
+              <w:t>설계는 확정했으나 아직 만들지 않은 요소다. 숨기지 않고 그대로 적는다</w:t>
             </w:r>
           </w:p>
         </w:tc>
@@ -471,7 +471,7 @@
                 <w:sz w:val="18"/>
                 <w:rFonts w:eastAsia="맑은 고딕"/>
               </w:rPr>
-              <w:t>lo-fi</w:t>
+              <w:t>저해상도 뼈대 그림(lo-fi)</w:t>
             </w:r>
           </w:p>
         </w:tc>
@@ -488,7 +488,7 @@
                 <w:sz w:val="18"/>
                 <w:rFonts w:eastAsia="맑은 고딕"/>
               </w:rPr>
-              <w:t>색·글꼴을 쓰지 않는다. 무엇이 어디에 있고 무엇을 누르면 어디로 가는지만 그린다. 색이 들어간 실제 화면 캡처는 「결과물」이지 「설계」가 아니므로 설계서에 넣지 않는다.</w:t>
+              <w:t>색과 글꼴을 쓰지 않는다. 무엇이 어디에 있고 무엇을 누르면 어디로 가는지만 그린다. 색이 들어간 실제 화면 캡처는 「결과물」이지 「설계」가 아니므로 설계서에 넣지 않는다.</w:t>
             </w:r>
           </w:p>
         </w:tc>
@@ -642,7 +642,7 @@
                 <w:sz w:val="18"/>
                 <w:rFonts w:eastAsia="맑은 고딕"/>
               </w:rPr>
-              <w:t>홈: 다국어 진입</w:t>
+              <w:t>홈(다국어 진입)</w:t>
             </w:r>
           </w:p>
         </w:tc>
@@ -729,7 +729,7 @@
                 <w:sz w:val="18"/>
                 <w:rFonts w:eastAsia="맑은 고딕"/>
               </w:rPr>
-              <w:t>문의: 연락 방법 고르기 → 신청서</w:t>
+              <w:t>문의(연락 방법 고르기 → 신청서)</w:t>
             </w:r>
           </w:p>
         </w:tc>
@@ -990,7 +990,7 @@
                 <w:sz w:val="18"/>
                 <w:rFonts w:eastAsia="맑은 고딕"/>
               </w:rPr>
-              <w:t>소견 확인: 환자용</w:t>
+              <w:t>소견 확인(환자용)</w:t>
             </w:r>
           </w:p>
         </w:tc>
@@ -1164,7 +1164,7 @@
                 <w:sz w:val="18"/>
                 <w:rFonts w:eastAsia="맑은 고딕"/>
               </w:rPr>
-              <w:t>케이스 상세: 문의 하나를 끝까지</w:t>
+              <w:t>케이스 상세(문의 하나를 끝까지)</w:t>
             </w:r>
           </w:p>
         </w:tc>
@@ -1251,7 +1251,7 @@
                 <w:sz w:val="18"/>
                 <w:rFonts w:eastAsia="맑은 고딕"/>
               </w:rPr>
-              <w:t>사후관리: 환자 화면(내 진료 관리)</w:t>
+              <w:t>사후관리(환자 화면)</w:t>
             </w:r>
           </w:p>
         </w:tc>
@@ -1597,7 +1597,7 @@
           <w:sz w:val="24"/>
           <w:rFonts w:eastAsia="맑은 고딕"/>
         </w:rPr>
-        <w:t>P-01. 홈: 다국어 진입</w:t>
+        <w:t>P-01. 홈(다국어 진입)</w:t>
       </w:r>
     </w:p>
     <w:tbl>
@@ -1869,7 +1869,7 @@
           <w:sz w:val="18"/>
           <w:rFonts w:eastAsia="맑은 고딕"/>
         </w:rPr>
-        <w:t>· 히어로: 큰 제목 「한국 최고 종양 전문의의 제2의견」 + 부제 3줄 + 단추 [무료 상담] 하나</w:t>
+        <w:t>· 첫 화면 큰 배너(히어로): 큰 제목 「한국 최고 종양 전문의의 제2의견」 + 부제 3줄 + 단추 [무료 상담] 하나</w:t>
       </w:r>
     </w:p>
     <w:p>
@@ -1883,7 +1883,7 @@
           <w:sz w:val="18"/>
           <w:rFonts w:eastAsia="맑은 고딕"/>
         </w:rPr>
-        <w:t>· 본문 큰 덩어리 10개: 왜 한국인가 / 우리 의료팀 / healwith 가 하는 일 / 어떻게 진행되나 / 주요 암종 / 파트너 병원 / 진단부터 회복까지 동행 / 자주 묻는 질문 / 긴급 도움 / 오늘 시작하기</w:t>
+        <w:t>· 본문 구역 10개: 왜 한국인가 / 우리 의료팀 / healwith 가 하는 일 / 어떻게 진행되나 / 주요 암종 / 파트너 병원 / 진단부터 회복까지 동행 / 자주 묻는 질문 / 긴급 도움 / 오늘 시작하기</w:t>
       </w:r>
     </w:p>
     <w:p>
@@ -1897,7 +1897,7 @@
           <w:sz w:val="18"/>
           <w:rFonts w:eastAsia="맑은 고딕"/>
         </w:rPr>
-        <w:t>· 우하단: 떠 있는 대화 단추(「도움말」 말풍선) = AI 상담 진입점</w:t>
+        <w:t>· 우하단: 화면에 떠 있는 대화 단추(「도움말」 말풍선)로, AI 상담으로 들어가는 입구다</w:t>
       </w:r>
     </w:p>
     <w:p>
@@ -1936,7 +1936,7 @@
           <w:sz w:val="20"/>
           <w:rFonts w:eastAsia="맑은 고딕"/>
         </w:rPr>
-        <w:t>다루는 데이터 (2026-08-19 실측)</w:t>
+        <w:t>다루는 데이터 (2026. 8. 20. 실측)</w:t>
       </w:r>
     </w:p>
     <w:p>
@@ -1950,7 +1950,7 @@
           <w:sz w:val="18"/>
           <w:rFonts w:eastAsia="맑은 고딕"/>
         </w:rPr>
-        <w:t>· 다국어 사전: 언어당 1,753키, 러시아어·카자흐어 각 100% (자동 검사 통과)</w:t>
+        <w:t>· 다국어 사전(i18n): 언어당 1,753키, 러시아어·카자흐어 각 100% (자동 검사 통과)</w:t>
       </w:r>
     </w:p>
     <w:p>
@@ -1964,7 +1964,7 @@
           <w:sz w:val="18"/>
           <w:rFonts w:eastAsia="맑은 고딕"/>
         </w:rPr>
-        <w:t>· hospitals: 8건 발행(협진 대학병원 4 + 면력한방병원 4지점). 그 외 이름·주소가 비어 미발행 상태인 빈 행 1건이 남아 있다</w:t>
+        <w:t>· 병원(hospitals): 발행 8곳(협진 대학병원 4 + 면력한방병원 4지점). 나머지 1행은 시험용 등록이라 미발행 상태다</w:t>
       </w:r>
     </w:p>
     <w:p>
@@ -1978,7 +1978,7 @@
           <w:sz w:val="18"/>
           <w:rFonts w:eastAsia="맑은 고딕"/>
         </w:rPr>
-        <w:t>· site_settings: 노출 문구·배너(관리자 화면에서 수정)</w:t>
+        <w:t>· 화면 설정(site_settings): 노출 문구·배너를 관리자 화면에서 고친다</w:t>
       </w:r>
     </w:p>
     <w:p>
@@ -2061,7 +2061,7 @@
           <w:sz w:val="24"/>
           <w:rFonts w:eastAsia="맑은 고딕"/>
         </w:rPr>
-        <w:t>P-02. 문의: 연락 방법 고르기 → 신청서</w:t>
+        <w:t>P-02. 문의(연락 방법 고르기 → 신청서)</w:t>
       </w:r>
     </w:p>
     <w:tbl>
@@ -2251,7 +2251,7 @@
                 <w:sz w:val="18"/>
                 <w:rFonts w:eastAsia="맑은 고딕"/>
               </w:rPr>
-              <w:t>먼저 「연락하기 편한 방법」을 고르게 해 문턱을 낮추고, 신청서를 고른 사람만 폼으로 보낸다. 대학병원 의뢰에 필요한 자료는 접수 뒤 2단계에서 받는다.</w:t>
+              <w:t>먼저 「연락하기 편한 방법」을 고르게 해 문턱을 낮추고, 신청서를 고른 사람만 입력 양식으로 보낸다. 대학병원 의뢰에 필요한 자료는 접수 뒤 2단계에서 받는다.</w:t>
             </w:r>
           </w:p>
         </w:tc>
@@ -2375,7 +2375,7 @@
           <w:sz w:val="18"/>
           <w:rFonts w:eastAsia="맑은 고딕"/>
         </w:rPr>
-        <w:t>· 접수 뒤 2단계: 별도 주소 /inquiry/intake (문의번호·열쇠 필요). 첨부 최대 10개, 건당 200MB</w:t>
+        <w:t>· 접수 뒤 2단계: 별도 주소 /inquiry/intake (문의번호와 접근 토큰이 있어야 한다). 첨부 최대 10개, 건당 200MB</w:t>
       </w:r>
     </w:p>
     <w:p>
@@ -2386,7 +2386,7 @@
           <w:sz w:val="20"/>
           <w:rFonts w:eastAsia="맑은 고딕"/>
         </w:rPr>
-        <w:t>다루는 데이터 (2026-08-19 실측)</w:t>
+        <w:t>다루는 데이터 (2026. 8. 20. 실측)</w:t>
       </w:r>
     </w:p>
     <w:p>
@@ -2400,7 +2400,7 @@
           <w:sz w:val="18"/>
           <w:rFonts w:eastAsia="맑은 고딕"/>
         </w:rPr>
-        <w:t>· inquiries: 전체 144건 중 실환자 8건(시험 문의는 표식으로 분리)</w:t>
+        <w:t>· 문의(inquiries): 전체 145건 중 실환자 8건이다. 시험 문의는 표식으로 갈라 둔다</w:t>
       </w:r>
     </w:p>
     <w:p>
@@ -2414,7 +2414,7 @@
           <w:sz w:val="18"/>
           <w:rFonts w:eastAsia="맑은 고딕"/>
         </w:rPr>
-        <w:t>· cancer_patient_intakes: 59건(암종·병기·치료 이력)</w:t>
+        <w:t>· 환자 상세(cancer_patient_intakes): 64건으로 암종·병기·치료 이력을 담는다</w:t>
       </w:r>
     </w:p>
     <w:p>
@@ -2494,7 +2494,7 @@
           <w:sz w:val="18"/>
           <w:rFonts w:eastAsia="맑은 고딕"/>
         </w:rPr>
-        <w:t>※ 2단계는 접수 후에만 들어간다. 문의번호·열쇠 없이 열면 「Missing inquiryId or token」.</w:t>
+        <w:t>※ 2단계는 접수한 뒤에만 들어갈 수 있다. 문의번호나 접근 토큰 없이 열면 값이 없다는 안내가 뜬다.</w:t>
       </w:r>
     </w:p>
     <w:p>
@@ -2852,7 +2852,7 @@
           <w:sz w:val="20"/>
           <w:rFonts w:eastAsia="맑은 고딕"/>
         </w:rPr>
-        <w:t>다루는 데이터 (2026-08-19 실측)</w:t>
+        <w:t>다루는 데이터 (2026. 8. 20. 실측)</w:t>
       </w:r>
     </w:p>
     <w:p>
@@ -2866,7 +2866,7 @@
           <w:sz w:val="18"/>
           <w:rFonts w:eastAsia="맑은 고딕"/>
         </w:rPr>
-        <w:t>· chat_threads 326건 · chat_messages 1,068건</w:t>
+        <w:t>· AI 상담 대화(chat_threads) 326건, 주고받은 말(chat_messages) 1,068건</w:t>
       </w:r>
     </w:p>
     <w:p>
@@ -2880,7 +2880,7 @@
           <w:sz w:val="18"/>
           <w:rFonts w:eastAsia="맑은 고딕"/>
         </w:rPr>
-        <w:t>· rag_documents 21건(병원·진료 항목): 검색 근거 원장</w:t>
+        <w:t>· 근거 문서(rag_documents) 21건으로 병원·진료 항목을 담는다. AI 가 답할 때 찾아 읽는 원장이다</w:t>
       </w:r>
     </w:p>
     <w:p>
@@ -2894,7 +2894,7 @@
           <w:sz w:val="18"/>
           <w:rFonts w:eastAsia="맑은 고딕"/>
         </w:rPr>
-        <w:t>· ai_response_evaluations · ai_regression_runs: 품질 자동 시험 기록</w:t>
+        <w:t>· 품질 자동 시험 기록(ai_response_evaluations, ai_regression_runs)</w:t>
       </w:r>
     </w:p>
     <w:p>
@@ -2945,7 +2945,7 @@
           <w:sz w:val="18"/>
           <w:rFonts w:eastAsia="맑은 고딕"/>
         </w:rPr>
-        <w:t>※ 동작 : 질문 → 의미 변환 → 자체 DB 검색 → 근거 읽기 → 출처와 함께 답변(2~3초).</w:t>
+        <w:t>※ 동작: 질문 → 의미 변환 → 자체 DB 검색 → 근거 읽기 → 출처와 함께 답변(2~3초).</w:t>
       </w:r>
     </w:p>
     <w:p>
@@ -3302,7 +3302,7 @@
           <w:sz w:val="20"/>
           <w:rFonts w:eastAsia="맑은 고딕"/>
         </w:rPr>
-        <w:t>다루는 데이터 (2026-08-19 실측)</w:t>
+        <w:t>다루는 데이터 (2026. 8. 20. 실측)</w:t>
       </w:r>
     </w:p>
     <w:p>
@@ -3316,7 +3316,7 @@
           <w:sz w:val="18"/>
           <w:rFonts w:eastAsia="맑은 고딕"/>
         </w:rPr>
-        <w:t>· consultation_sessions 132건(7월 83 · 8월 49) · 입퇴장 기록 323건</w:t>
+        <w:t>· 상담 세션(consultation_sessions) 133건, 입퇴장 기록 325건</w:t>
       </w:r>
     </w:p>
     <w:p>
@@ -3330,7 +3330,7 @@
           <w:sz w:val="18"/>
           <w:rFonts w:eastAsia="맑은 고딕"/>
         </w:rPr>
-        <w:t>· consultation_translations 3,542건: 러→한 2,593 · 한→러 487 · 카자흐→한 117 등</w:t>
+        <w:t>· 통역 자막(consultation_translations) 3,277건이다(시험 방 제외). 러→한 2,487, 한→러 393, 카자흐→한 117 등</w:t>
       </w:r>
     </w:p>
     <w:p>
@@ -3410,7 +3410,7 @@
           <w:sz w:val="18"/>
           <w:rFonts w:eastAsia="맑은 고딕"/>
         </w:rPr>
-        <w:t>※ 초대는 57자 주소로 나가며 계정 없이 들어온다. 방은 참가자 2명부터 시작으로 본다.</w:t>
+        <w:t>※ 초대는 57자짜리 주소로 나가고 계정 없이 들어올 수 있다. 방은 참가자 2명부터 시작으로 본다.</w:t>
       </w:r>
     </w:p>
     <w:p>
@@ -3427,7 +3427,7 @@
           <w:sz w:val="24"/>
           <w:rFonts w:eastAsia="맑은 고딕"/>
         </w:rPr>
-        <w:t>P-05. 소견 확인: 환자용</w:t>
+        <w:t>P-05. 소견 확인(환자용)</w:t>
       </w:r>
     </w:p>
     <w:tbl>
@@ -3752,7 +3752,7 @@
           <w:sz w:val="20"/>
           <w:rFonts w:eastAsia="맑은 고딕"/>
         </w:rPr>
-        <w:t>다루는 데이터 (2026-08-19 실측)</w:t>
+        <w:t>다루는 데이터 (2026. 8. 20. 실측)</w:t>
       </w:r>
     </w:p>
     <w:p>
@@ -3766,7 +3766,7 @@
           <w:sz w:val="18"/>
           <w:rFonts w:eastAsia="맑은 고딕"/>
         </w:rPr>
-        <w:t>· case_opinions 6건(그중 환자에게 전달 5건) · opinion_requests 2건</w:t>
+        <w:t>· 제2의료소견(case_opinions) 6건을 확보해 6건 모두 환자에게 전달했다. 소견 요청(opinion_requests)은 2건이다</w:t>
       </w:r>
     </w:p>
     <w:p>
@@ -3780,7 +3780,7 @@
           <w:sz w:val="18"/>
           <w:rFonts w:eastAsia="맑은 고딕"/>
         </w:rPr>
-        <w:t>· attachment_translations 12건: 외국 검사지·진료기록을 AI가 읽어 표의 행·칸까지 구조화</w:t>
+        <w:t>· 서류 번역(attachment_translations) 12건이다. 외국 검사지와 진료기록을 AI 가 읽어 표의 행과 칸까지 구조를 살려 옮긴다</w:t>
       </w:r>
     </w:p>
     <w:p>
@@ -4159,7 +4159,7 @@
           <w:sz w:val="20"/>
           <w:rFonts w:eastAsia="맑은 고딕"/>
         </w:rPr>
-        <w:t>다루는 데이터 (2026-08-19 실측)</w:t>
+        <w:t>다루는 데이터 (2026. 8. 20. 실측)</w:t>
       </w:r>
     </w:p>
     <w:p>
@@ -4173,7 +4173,7 @@
           <w:sz w:val="18"/>
           <w:rFonts w:eastAsia="맑은 고딕"/>
         </w:rPr>
-        <w:t>· inquiries: 목록에 실제로 뜬 건수 8건 = 실환자 8건(시험 문의는 자동으로 빠진다)</w:t>
+        <w:t>· 문의(inquiries): 목록에 실제로 뜬 건수가 8건으로 실환자 수와 같다. 시험 문의는 자동으로 빠진다</w:t>
       </w:r>
     </w:p>
     <w:p>
@@ -4187,7 +4187,7 @@
           <w:sz w:val="18"/>
           <w:rFonts w:eastAsia="맑은 고딕"/>
         </w:rPr>
-        <w:t>· notifications 1,027건(새 문의 즉시 알림)</w:t>
+        <w:t>· 알림(notifications) 1,043건으로, 새 문의가 들어오면 바로 보낸다</w:t>
       </w:r>
     </w:p>
     <w:p>
@@ -4255,7 +4255,7 @@
           <w:sz w:val="24"/>
           <w:rFonts w:eastAsia="맑은 고딕"/>
         </w:rPr>
-        <w:t>P-07. 케이스 상세: 문의 하나를 끝까지</w:t>
+        <w:t>P-07. 케이스 상세(문의 하나를 끝까지)</w:t>
       </w:r>
     </w:p>
     <w:tbl>
@@ -4608,7 +4608,7 @@
           <w:sz w:val="20"/>
           <w:rFonts w:eastAsia="맑은 고딕"/>
         </w:rPr>
-        <w:t>다루는 데이터 (2026-08-19 실측)</w:t>
+        <w:t>다루는 데이터 (2026. 8. 20. 실측)</w:t>
       </w:r>
     </w:p>
     <w:p>
@@ -4622,7 +4622,7 @@
           <w:sz w:val="18"/>
           <w:rFonts w:eastAsia="맑은 고딕"/>
         </w:rPr>
-        <w:t>· cotreatment_referrals 4건 · case_shared_documents 8건 · case_opinions 6건(전달 5건)</w:t>
+        <w:t>· 협진 의뢰(cotreatment_referrals) 4건, 공유 서류(case_shared_documents) 8건, 제2의료소견(case_opinions) 6건 전부 전달 완료</w:t>
       </w:r>
     </w:p>
     <w:p>
@@ -4636,7 +4636,7 @@
           <w:sz w:val="18"/>
           <w:rFonts w:eastAsia="맑은 고딕"/>
         </w:rPr>
-        <w:t>· attachment_translations 12건: 외국 검사지를 표의 행·칸까지 구조화(숫자·단위·정상범위는 원문 그대로)</w:t>
+        <w:t>· 서류 번역(attachment_translations) 12건이다. 표의 행과 칸까지 구조를 살려 옮기되 숫자·단위·정상범위는 원문 그대로 둔다</w:t>
       </w:r>
     </w:p>
     <w:p>
@@ -4719,7 +4719,7 @@
           <w:sz w:val="24"/>
           <w:rFonts w:eastAsia="맑은 고딕"/>
         </w:rPr>
-        <w:t>P-08. 사후관리: 환자 화면(내 진료 관리)</w:t>
+        <w:t>P-08. 사후관리(환자 화면)</w:t>
       </w:r>
     </w:p>
     <w:tbl>
@@ -5033,7 +5033,7 @@
           <w:sz w:val="18"/>
           <w:rFonts w:eastAsia="맑은 고딕"/>
         </w:rPr>
-        <w:t>· 뒤에서 도는 것. AI가 증상 기록을 읽어 위험도를 산출하고 담당자에게 알린다</w:t>
+        <w:t>· 화면 뒤에서 자동으로 도는 것: AI 가 증상 기록을 읽어 위험도를 매기고 담당자에게 알린다</w:t>
       </w:r>
     </w:p>
     <w:p>
@@ -5047,7 +5047,7 @@
           <w:sz w:val="18"/>
           <w:rFonts w:eastAsia="맑은 고딕"/>
         </w:rPr>
-        <w:t>· [남은 것] 단계별 교육 자동 발송: 귀국 후 시기에 맞춰 보내는 부분만 화면에 안 붙었다</w:t>
+        <w:t>· [남은 것] 단계별 교육 자동 발송: 귀국 후 시기에 맞춰 보내는 부분을 아직 만들지 않았다</w:t>
       </w:r>
     </w:p>
     <w:p>
@@ -5058,7 +5058,7 @@
           <w:sz w:val="20"/>
           <w:rFonts w:eastAsia="맑은 고딕"/>
         </w:rPr>
-        <w:t>다루는 데이터 (2026-08-19 실측)</w:t>
+        <w:t>다루는 데이터 (2026. 8. 20. 실측)</w:t>
       </w:r>
     </w:p>
     <w:p>
@@ -5072,7 +5072,7 @@
           <w:sz w:val="18"/>
           <w:rFonts w:eastAsia="맑은 고딕"/>
         </w:rPr>
-        <w:t>· education_contents 18건: 위·유방·간·폐·갑상선 5종, 러시아어 본문 전건 채워 발행</w:t>
+        <w:t>· 교육 콘텐츠(education_contents) 18건이다. 위·유방·간·폐·갑상선 5종이며 러시아어 본문을 전건 채워 발행했다</w:t>
       </w:r>
     </w:p>
     <w:p>
@@ -5086,7 +5086,7 @@
           <w:sz w:val="18"/>
           <w:rFonts w:eastAsia="맑은 고딕"/>
         </w:rPr>
-        <w:t>· symptom_reports 1건 · followup_schedules 0건: 기능은 서 있으나 유치 확정 환자가 없어 실사용이 없다</w:t>
+        <w:t>· 증상 기록(symptom_reports) 1건, 사후관리 일정(followup_schedules) 0건이다. 기능은 만들어져 있으나 유치 확정 환자가 없어 실사용이 없다</w:t>
       </w:r>
     </w:p>
     <w:p>
@@ -5100,7 +5100,7 @@
           <w:sz w:val="18"/>
           <w:rFonts w:eastAsia="맑은 고딕"/>
         </w:rPr>
-        <w:t>· device_tokens 7건(알림 등록)</w:t>
+        <w:t>· 알림 기기 등록(device_tokens) 11건</w:t>
       </w:r>
     </w:p>
     <w:p>
@@ -5166,7 +5166,7 @@
           <w:sz w:val="18"/>
           <w:rFonts w:eastAsia="맑은 고딕"/>
         </w:rPr>
-        <w:t>※ 교육 콘텐츠는 환자 전용 화면이 아니라 공개 화면 /education 을 그대로 쓴다. 6개 언어로 실서비스 중.</w:t>
+        <w:t>※ 교육 콘텐츠는 환자 전용 화면이 아니라 공개 화면 /education 을 그대로 쓴다. 6개 언어로 실제 서비스하고 있다.</w:t>
       </w:r>
     </w:p>
     <w:p>
@@ -5181,7 +5181,7 @@
           <w:sz w:val="18"/>
           <w:rFonts w:eastAsia="맑은 고딕"/>
         </w:rPr>
-        <w:t>※ 「이상 징후 알림」은 환자 화면의 칸이 아니라 뒤에서 도는 판정이다.</w:t>
+        <w:t>※ 「이상 징후 알림」은 환자 화면에 있는 칸이 아니라, 화면 뒤에서 자동으로 도는 판정이다.</w:t>
       </w:r>
     </w:p>
     <w:p>
@@ -5523,7 +5523,7 @@
           <w:sz w:val="20"/>
           <w:rFonts w:eastAsia="맑은 고딕"/>
         </w:rPr>
-        <w:t>다루는 데이터 (2026-08-19 실측)</w:t>
+        <w:t>다루는 데이터 (2026. 8. 20. 실측)</w:t>
       </w:r>
     </w:p>
     <w:p>
@@ -5537,7 +5537,7 @@
           <w:sz w:val="18"/>
           <w:rFonts w:eastAsia="맑은 고딕"/>
         </w:rPr>
-        <w:t>· 2026-08-19 기준: 문의 8 · 사전상담 완료 1(12.5%) · 유치 0 · 사후관리 0</w:t>
+        <w:t>· 2026. 8. 20. 기준: 문의 8건, 사전상담 완료 1건(12.5%), 유치 0건, 사후관리 0건</w:t>
       </w:r>
     </w:p>
     <w:p>
@@ -5565,7 +5565,7 @@
           <w:sz w:val="18"/>
           <w:rFonts w:eastAsia="맑은 고딕"/>
         </w:rPr>
-        <w:t>· kpi_snapshots 93건 · 목표값 단일 기준 파일 하나(화면과 문서가 어긋나지 않게)</w:t>
+        <w:t>· 성과 기록(kpi_snapshots) 94건이다. 목표값은 파일 한 곳에만 두어 화면과 문서가 어긋나지 않게 한다</w:t>
       </w:r>
     </w:p>
     <w:p>
@@ -5906,7 +5906,7 @@
           <w:sz w:val="18"/>
           <w:rFonts w:eastAsia="맑은 고딕"/>
         </w:rPr>
-        <w:t>· 환자 동선 : 홈 → AI 상담 → 문의 접수 → (코디) → 원격협진 · 소견 확인 → 사후관리</w:t>
+        <w:t>· 환자 동선: 홈 → AI 상담 → 문의 접수 → (코디) → 원격협진 · 소견 확인 → 사후관리</w:t>
       </w:r>
     </w:p>
     <w:p>
@@ -5920,7 +5920,7 @@
           <w:sz w:val="18"/>
           <w:rFonts w:eastAsia="맑은 고딕"/>
         </w:rPr>
-        <w:t>· 운영 동선 : 인박스 → 케이스 상세 → 병원 의뢰 → 회신 등록 → 환자 전달</w:t>
+        <w:t>· 운영 동선: 인박스 → 케이스 상세 → 병원 의뢰 → 회신 등록 → 환자 전달</w:t>
       </w:r>
     </w:p>
     <w:p>
@@ -5934,7 +5934,7 @@
           <w:sz w:val="18"/>
           <w:rFonts w:eastAsia="맑은 고딕"/>
         </w:rPr>
-        <w:t>· 권한 5종 : 환자·코디네이터·에이전시·해외 의료기관·병원</w:t>
+        <w:t>· 권한 5종: 환자·코디네이터·에이전시·해외 의료기관·병원</w:t>
       </w:r>
     </w:p>
     <w:p>
@@ -5945,7 +5945,7 @@
           <w:sz w:val="20"/>
           <w:rFonts w:eastAsia="맑은 고딕"/>
         </w:rPr>
-        <w:t>다루는 데이터 (2026-08-19 실측)</w:t>
+        <w:t>다루는 데이터 (2026. 8. 20. 실측)</w:t>
       </w:r>
     </w:p>
     <w:p>
@@ -6027,7 +6027,7 @@
           <w:sz w:val="28"/>
           <w:rFonts w:eastAsia="맑은 고딕"/>
         </w:rPr>
-        <w:t>3. 권한별 화면 접근 범위</w:t>
+        <w:t>4. 권한별 화면 접근 범위</w:t>
       </w:r>
     </w:p>
     <w:p>
@@ -6038,7 +6038,7 @@
           <w:sz w:val="18"/>
           <w:rFonts w:eastAsia="맑은 고딕"/>
         </w:rPr>
-        <w:t>화면 접근은 역할 기반으로 나뉘며, 권한은 서버에서 판정한다(화면 숨김만으로 막지 않는다).</w:t>
+        <w:t>화면 접근 범위는 역할에 따라 나뉜다. 권한은 서버에서 판정하며, 화면에서 감추는 것만으로는 막지 않는다.</w:t>
       </w:r>
     </w:p>
     <w:tbl>
@@ -6628,7 +6628,7 @@
           <w:sz w:val="28"/>
           <w:rFonts w:eastAsia="맑은 고딕"/>
         </w:rPr>
-        <w:t>4. 남은 설계 항목</w:t>
+        <w:t>5. 남은 설계 항목</w:t>
       </w:r>
     </w:p>
     <w:tbl>
@@ -6765,7 +6765,7 @@
                 <w:sz w:val="18"/>
                 <w:rFonts w:eastAsia="맑은 고딕"/>
               </w:rPr>
-              <w:t>판정 엔진 구현 · 화면 연결 남음</w:t>
+              <w:t>판정 부분은 만들었고 화면 연결이 남았다</w:t>
             </w:r>
           </w:p>
         </w:tc>

</xml_diff>

<commit_message>
chore: 작업 자동 저장 (2026-08-20 18:27)
</commit_message>
<xml_diff>
--- a/docs/government-project/01-1_화면설계서.docx
+++ b/docs/government-project/01-1_화면설계서.docx
@@ -452,7 +452,7 @@
                 <w:sz w:val="18"/>
                 <w:rFonts w:eastAsia="맑은 고딕"/>
               </w:rPr>
-              <w:t>설계는 확정했으나 아직 만들지 않은 요소다. 숨기지 않고 그대로 적는다</w:t>
+              <w:t>설계는 확정했으나 아직 만들지 않은 화면 요소. 숨기지 않고 그대로 표시한다</w:t>
             </w:r>
           </w:p>
         </w:tc>
@@ -1523,7 +1523,7 @@
           <w:sz w:val="20"/>
           <w:rFonts w:eastAsia="맑은 고딕"/>
         </w:rPr>
-        <w:t>이용자부터 데이터 보관까지 플랫폼 전체가 어떻게 이어지는지 한 장으로 보인다. 점선 상자는 바깥 서비스이고 나머지는 직접 만들어 운영한다.</w:t>
+        <w:t>이용자부터 데이터 보관까지 플랫폼 전체가 어떻게 이어지는지 한 장에 담았다. 점선 상자는 바깥 서비스이고 나머지는 직접 만들어 운영한다.</w:t>
       </w:r>
     </w:p>
     <w:p>
@@ -1897,7 +1897,7 @@
           <w:sz w:val="18"/>
           <w:rFonts w:eastAsia="맑은 고딕"/>
         </w:rPr>
-        <w:t>· 우하단: 화면에 떠 있는 대화 단추(「도움말」 말풍선)로, AI 상담으로 들어가는 입구다</w:t>
+        <w:t>· 우하단: 화면에 떠 있는 대화 단추(「도움말」 말풍선). AI 사전상담으로 들어가는 입구다</w:t>
       </w:r>
     </w:p>
     <w:p>
@@ -1911,7 +1911,7 @@
           <w:sz w:val="18"/>
           <w:rFonts w:eastAsia="맑은 고딕"/>
         </w:rPr>
-        <w:t>· 맨아래: 유치업 등록번호 · 보증보험 · 법정 고지 · 개인정보 처리방침</w:t>
+        <w:t>· 맨 아래: 유치업 등록번호 · 보증보험 · 법정 고지 · 개인정보 처리방침</w:t>
       </w:r>
     </w:p>
     <w:p>
@@ -1964,7 +1964,7 @@
           <w:sz w:val="18"/>
           <w:rFonts w:eastAsia="맑은 고딕"/>
         </w:rPr>
-        <w:t>· 병원(hospitals): 발행 8곳(협진 대학병원 4 + 면력한방병원 4지점). 나머지 1행은 시험용 등록이라 미발행 상태다</w:t>
+        <w:t>· 병원(hospitals): 발행 8곳(협진 대학병원 4 + 면력한방병원 4지점). 나머지 1곳은 시험용 등록이라 공개하지 않는다</w:t>
       </w:r>
     </w:p>
     <w:p>
@@ -2400,7 +2400,7 @@
           <w:sz w:val="18"/>
           <w:rFonts w:eastAsia="맑은 고딕"/>
         </w:rPr>
-        <w:t>· 문의(inquiries): 전체 145건 중 실환자 8건이다. 시험 문의는 표식으로 갈라 둔다</w:t>
+        <w:t>· 문의(inquiries): 전체 145건 중 실제 환자 문의 8건. 나머지는 시험 문의로 표시해 실적에서 뺀다</w:t>
       </w:r>
     </w:p>
     <w:p>
@@ -2414,7 +2414,7 @@
           <w:sz w:val="18"/>
           <w:rFonts w:eastAsia="맑은 고딕"/>
         </w:rPr>
-        <w:t>· 환자 상세(cancer_patient_intakes): 64건으로 암종·병기·치료 이력을 담는다</w:t>
+        <w:t>· 환자 상세(cancer_patient_intakes): 64건. 암종·병기·치료 이력을 담는다</w:t>
       </w:r>
     </w:p>
     <w:p>
@@ -2880,7 +2880,7 @@
           <w:sz w:val="18"/>
           <w:rFonts w:eastAsia="맑은 고딕"/>
         </w:rPr>
-        <w:t>· 근거 문서(rag_documents) 21건으로 병원·진료 항목을 담는다. AI 가 답할 때 찾아 읽는 원장이다</w:t>
+        <w:t>· 근거 문서(rag_documents) 21건. 병원·진료 정보를 담으며, AI 는 답할 때 이 안에서만 근거를 찾는다</w:t>
       </w:r>
     </w:p>
     <w:p>
@@ -3330,7 +3330,7 @@
           <w:sz w:val="18"/>
           <w:rFonts w:eastAsia="맑은 고딕"/>
         </w:rPr>
-        <w:t>· 통역 자막(consultation_translations) 3,277건이다(시험 방 제외). 러→한 2,487, 한→러 393, 카자흐→한 117 등</w:t>
+        <w:t>· 통역 자막(consultation_translations) 3,277건(시험 방 제외). 러→한 2,487 · 한→러 393 · 카자흐→한 117 등</w:t>
       </w:r>
     </w:p>
     <w:p>
@@ -3766,7 +3766,7 @@
           <w:sz w:val="18"/>
           <w:rFonts w:eastAsia="맑은 고딕"/>
         </w:rPr>
-        <w:t>· 제2의료소견(case_opinions) 6건을 확보해 6건 모두 환자에게 전달했다. 소견 요청(opinion_requests)은 2건이다</w:t>
+        <w:t>· 제2의료소견(case_opinions) 6건. 전건 환자에게 전달 완료. 소견 요청(opinion_requests) 2건</w:t>
       </w:r>
     </w:p>
     <w:p>
@@ -3780,7 +3780,7 @@
           <w:sz w:val="18"/>
           <w:rFonts w:eastAsia="맑은 고딕"/>
         </w:rPr>
-        <w:t>· 서류 번역(attachment_translations) 12건이다. 외국 검사지와 진료기록을 AI 가 읽어 표의 행과 칸까지 구조를 살려 옮긴다</w:t>
+        <w:t>· 서류 번역(attachment_translations) 12건. 외국 검사지와 진료기록을 AI 가 읽어 표의 행과 칸까지 구조를 살려 옮긴다</w:t>
       </w:r>
     </w:p>
     <w:p>
@@ -4106,7 +4106,7 @@
           <w:sz w:val="18"/>
           <w:rFonts w:eastAsia="맑은 고딕"/>
         </w:rPr>
-        <w:t>· 왼쪽 메뉴 16개: 대시보드 · 문의함 · AI 상담 리드 · 의뢰·케이스/병원배정 · 상담 일정 · 유치 전환 · 사후관리·만족도 · 파트너 발굴 · 메시지 · 비자 트래킹 · 견적 · 증상 알림 · 콘텐츠 편집 · 개선 요청함 · 설정</w:t>
+        <w:t>· 왼쪽 메뉴 15개: 대시보드 · 문의함 · AI 상담 리드 · 의뢰·케이스/병원배정 · 상담 일정 · 유치 전환 · 사후관리·만족도 · 파트너 발굴 · 메시지 · 비자 트래킹 · 견적 · 증상 알림 · 콘텐츠 편집 · 개선 요청함 · 설정</w:t>
       </w:r>
     </w:p>
     <w:p>
@@ -4173,7 +4173,7 @@
           <w:sz w:val="18"/>
           <w:rFonts w:eastAsia="맑은 고딕"/>
         </w:rPr>
-        <w:t>· 문의(inquiries): 목록에 실제로 뜬 건수가 8건으로 실환자 수와 같다. 시험 문의는 자동으로 빠진다</w:t>
+        <w:t>· 문의(inquiries): 목록에 뜨는 건수 8건. 실환자 수와 같다(시험 문의는 자동으로 빠진다)</w:t>
       </w:r>
     </w:p>
     <w:p>
@@ -4187,7 +4187,7 @@
           <w:sz w:val="18"/>
           <w:rFonts w:eastAsia="맑은 고딕"/>
         </w:rPr>
-        <w:t>· 알림(notifications) 1,043건으로, 새 문의가 들어오면 바로 보낸다</w:t>
+        <w:t>· 알림(notifications) 1,043건. 새 문의가 들어오면 즉시 발송한다</w:t>
       </w:r>
     </w:p>
     <w:p>
@@ -4636,7 +4636,7 @@
           <w:sz w:val="18"/>
           <w:rFonts w:eastAsia="맑은 고딕"/>
         </w:rPr>
-        <w:t>· 서류 번역(attachment_translations) 12건이다. 표의 행과 칸까지 구조를 살려 옮기되 숫자·단위·정상범위는 원문 그대로 둔다</w:t>
+        <w:t>· 서류 번역(attachment_translations) 12건. 표의 행과 칸까지 구조를 살려 옮기되 숫자·단위·정상범위는 원문 그대로 둔다</w:t>
       </w:r>
     </w:p>
     <w:p>
@@ -5047,7 +5047,7 @@
           <w:sz w:val="18"/>
           <w:rFonts w:eastAsia="맑은 고딕"/>
         </w:rPr>
-        <w:t>· [남은 것] 단계별 교육 자동 발송: 귀국 후 시기에 맞춰 보내는 부분을 아직 만들지 않았다</w:t>
+        <w:t>· [남은 것] 단계별 교육 자동 발송: 귀국 후 시기에 맞춰 보내는 부분은 아직 만들지 않았다</w:t>
       </w:r>
     </w:p>
     <w:p>
@@ -5072,7 +5072,7 @@
           <w:sz w:val="18"/>
           <w:rFonts w:eastAsia="맑은 고딕"/>
         </w:rPr>
-        <w:t>· 교육 콘텐츠(education_contents) 18건이다. 위·유방·간·폐·갑상선 5종이며 러시아어 본문을 전건 채워 발행했다</w:t>
+        <w:t>· 교육 콘텐츠(education_contents) 18건. 위·유방·간·폐·갑상선 5종이며 러시아어 본문까지 전건 채워 발행했다</w:t>
       </w:r>
     </w:p>
     <w:p>
@@ -5086,7 +5086,7 @@
           <w:sz w:val="18"/>
           <w:rFonts w:eastAsia="맑은 고딕"/>
         </w:rPr>
-        <w:t>· 증상 기록(symptom_reports) 1건, 사후관리 일정(followup_schedules) 0건이다. 기능은 만들어져 있으나 유치 확정 환자가 없어 실사용이 없다</w:t>
+        <w:t>· 증상 기록(symptom_reports) 1건 · 사후관리 일정(followup_schedules) 0건. 기능은 완성했으나 유치 확정 환자가 아직 없어 실사용 기록이 없다</w:t>
       </w:r>
     </w:p>
     <w:p>
@@ -5137,21 +5137,6 @@
           <w:rFonts w:eastAsia="맑은 고딕"/>
         </w:rPr>
         <w:t>설계 메모</w:t>
-      </w:r>
-    </w:p>
-    <w:p>
-      <w:pPr>
-        <w:ind w:left="283"/>
-      </w:pPr>
-      <w:r>
-        <w:rPr>
-          <w:rFonts w:ascii="맑은 고딕" w:hAnsi="맑은 고딕"/>
-          <w:b w:val="0"/>
-          <w:color w:val="6E6E6E"/>
-          <w:sz w:val="18"/>
-          <w:rFonts w:eastAsia="맑은 고딕"/>
-        </w:rPr>
-        <w:t>※ 사후관리 카드는 6종이다.</w:t>
       </w:r>
     </w:p>
     <w:p>
@@ -5388,7 +5373,7 @@
                 <w:sz w:val="18"/>
                 <w:rFonts w:eastAsia="맑은 고딕"/>
               </w:rPr>
-              <w:t>성과지표를 사람이 세지 않고 화면이 세게 한다. 보고서 숫자와 화면 숫자가 갈리지 않게.</w:t>
+              <w:t>성과지표를 사람이 세지 않고 화면이 세게 한다. 보고서 숫자와 화면 숫자가 갈리지 않도록 한 곳에서 집계한다.</w:t>
             </w:r>
           </w:p>
         </w:tc>
@@ -5565,7 +5550,7 @@
           <w:sz w:val="18"/>
           <w:rFonts w:eastAsia="맑은 고딕"/>
         </w:rPr>
-        <w:t>· 성과 기록(kpi_snapshots) 94건이다. 목표값은 파일 한 곳에만 두어 화면과 문서가 어긋나지 않게 한다</w:t>
+        <w:t>· 성과 기록(kpi_snapshots) 94건. 목표값은 파일 한 곳에만 두어 화면과 문서가 어긋나지 않게 한다</w:t>
       </w:r>
     </w:p>
     <w:p>
@@ -5616,7 +5601,7 @@
           <w:sz w:val="18"/>
           <w:rFonts w:eastAsia="맑은 고딕"/>
         </w:rPr>
-        <w:t>※ 깔때기의 사전상담(1)은 문의에 연결된 건, 기관별 표의 사전상담(3)은 전체 세션: 세는 기준이 다르다.</w:t>
+        <w:t>※ 깔때기의 사전상담(1건)은 문의에 연결된 건만 세고, 기관별 표의 사전상담(3건)은 전체 세션을 센다. 세는 기준이 다르다.</w:t>
       </w:r>
     </w:p>
     <w:p>
@@ -5838,7 +5823,7 @@
                 <w:sz w:val="18"/>
                 <w:rFonts w:eastAsia="맑은 고딕"/>
               </w:rPr>
-              <w:t>환자·코디네이터·의료진이 어떤 순서로 화면을 지나는지 한 장으로 보인다.</w:t>
+              <w:t>환자·코디네이터·의료진이 어떤 순서로 화면을 지나는지 한 장에 담았다.</w:t>
             </w:r>
           </w:p>
         </w:tc>
@@ -6765,7 +6750,7 @@
                 <w:sz w:val="18"/>
                 <w:rFonts w:eastAsia="맑은 고딕"/>
               </w:rPr>
-              <w:t>판정 부분은 만들었고 화면 연결이 남았다</w:t>
+              <w:t>판정 로직 완료 · 화면 연결 남음</w:t>
             </w:r>
           </w:p>
         </w:tc>

</xml_diff>

<commit_message>
chore: 작업 자동 저장 (2026-08-20 18:30)
</commit_message>
<xml_diff>
--- a/docs/government-project/01-1_화면설계서.docx
+++ b/docs/government-project/01-1_화면설계서.docx
@@ -5955,31 +5955,6 @@
           <w:sz w:val="20"/>
           <w:rFonts w:eastAsia="맑은 고딕"/>
         </w:rPr>
-        <w:t>다음 화면 연결</w:t>
-      </w:r>
-    </w:p>
-    <w:p>
-      <w:pPr>
-        <w:ind w:left="283"/>
-      </w:pPr>
-      <w:r>
-        <w:rPr>
-          <w:rFonts w:ascii="맑은 고딕" w:hAnsi="맑은 고딕"/>
-          <w:b w:val="0"/>
-          <w:sz w:val="18"/>
-          <w:rFonts w:eastAsia="맑은 고딕"/>
-        </w:rPr>
-        <w:t>—</w:t>
-      </w:r>
-    </w:p>
-    <w:p>
-      <w:r>
-        <w:rPr>
-          <w:rFonts w:ascii="맑은 고딕" w:hAnsi="맑은 고딕"/>
-          <w:b w:val="0"/>
-          <w:sz w:val="20"/>
-          <w:rFonts w:eastAsia="맑은 고딕"/>
-        </w:rPr>
         <w:t>설계 메모</w:t>
       </w:r>
     </w:p>
@@ -5996,11 +5971,6 @@
           <w:rFonts w:eastAsia="맑은 고딕"/>
         </w:rPr>
         <w:t>※ 환자는 로그인 없이도 초대 링크로 상담방(P-04)·소견(P-05)에 들어올 수 있다.</w:t>
-      </w:r>
-    </w:p>
-    <w:p>
-      <w:r>
-        <w:br w:type="page"/>
       </w:r>
     </w:p>
     <w:p>

</xml_diff>